<commit_message>
script: rewrite to comment on slides, not read them
</commit_message>
<xml_diff>
--- a/outputs/Script_Soutenance.docx
+++ b/outputs/Script_Soutenance.docx
@@ -4,9 +4,9 @@
   <w:body>
     <w:p>
       <w:pPr>
-        <w:spacing w:before="80" w:after="40"/>
+        <w:spacing w:before="160" w:after="40"/>
         <w:pBdr>
-          <w:bottom w:val="single" w:sz="12" w:space="4" w:color="002255"/>
+          <w:bottom w:val="single" w:sz="10" w:space="4" w:color="002255"/>
         </w:pBdr>
       </w:pPr>
       <w:r>
@@ -14,9 +14,9 @@
           <w:b/>
           <w:i w:val="0"/>
           <w:color w:val="002255"/>
-          <w:sz w:val="40"/>
+          <w:sz w:val="34"/>
         </w:rPr>
-        <w:t>ORAL DEFENSE SCRIPT — WORD FOR WORD</w:t>
+        <w:t>ORAL DEFENSE SCRIPT</w:t>
       </w:r>
     </w:p>
     <w:p>
@@ -35,7 +35,7 @@
         <w:rPr>
           <w:b w:val="0"/>
           <w:i w:val="0"/>
-          <w:color w:val="555555"/>
+          <w:color w:val="666666"/>
           <w:sz w:val="20"/>
         </w:rPr>
         <w:t>Leo Cambreleng &amp; Lyam Oumedjeber  ·  EDHEC MSc DAAI  ·  June 2026</w:t>
@@ -46,23 +46,37 @@
         <w:rPr>
           <w:b w:val="0"/>
           <w:i/>
-          <w:color w:val="555555"/>
+          <w:color w:val="666666"/>
           <w:sz w:val="20"/>
         </w:rPr>
-        <w:t>FORMAT: 20 min presentation + Q&amp;A  ·  LEO speaks slides 1–7  ·  LYAM speaks slides 8–15  ·  Slide 16: both  ·  Target: ~17 min</w:t>
+        <w:t>LEO slides 1–7 (~7 min)  ·  LYAM slides 8–15 (~9 min 40 s)  ·  BOTH slide 16  ·  Total ~17 min</w:t>
       </w:r>
     </w:p>
     <w:p>
-      <w:pPr>
-        <w:spacing w:before="40" w:after="40"/>
-        <w:pBdr>
-          <w:bottom w:val="single" w:sz="4" w:space="1" w:color="CCCCCC"/>
-        </w:pBdr>
-      </w:pPr>
+      <w:r>
+        <w:rPr>
+          <w:b w:val="0"/>
+          <w:i/>
+          <w:color w:val="C0392B"/>
+          <w:sz w:val="20"/>
+        </w:rPr>
+        <w:t>Rule: don't read the slide — comment on it. Guide attention. Add what isn't written.</w:t>
+      </w:r>
     </w:p>
     <w:p>
       <w:pPr>
-        <w:spacing w:before="280" w:after="60"/>
+        <w:spacing w:before="120" w:after="120"/>
+        <w:pBdr>
+          <w:bottom w:val="single" w:sz="4" w:space="4" w:color="CCCCCC"/>
+        </w:pBdr>
+      </w:pPr>
+    </w:p>
+    <w:p>
+      <w:pPr>
+        <w:spacing w:before="320" w:after="80"/>
+        <w:pBdr>
+          <w:bottom w:val="single" w:sz="4" w:space="4" w:color="C8A032"/>
+        </w:pBdr>
       </w:pPr>
       <w:r>
         <w:rPr>
@@ -86,7 +100,7 @@
         <w:rPr>
           <w:b w:val="0"/>
           <w:i/>
-          <w:color w:val="555555"/>
+          <w:color w:val="666666"/>
           <w:sz w:val="22"/>
         </w:rPr>
         <w:t xml:space="preserve">  · ~20 s</w:t>
@@ -94,29 +108,70 @@
     </w:p>
     <w:p>
       <w:pPr>
-        <w:spacing w:before="0" w:after="80"/>
-        <w:ind w:left="227"/>
+        <w:spacing w:before="0" w:after="120"/>
+        <w:ind w:left="283"/>
       </w:pPr>
       <w:r>
         <w:rPr>
           <w:b w:val="0"/>
           <w:i w:val="0"/>
-          <w:color w:val="212529"/>
+          <w:sz w:val="24"/>
         </w:rPr>
-        <w:t>Good morning, Professor. I'm Leo Cambreleng, and with my co-author Lyam Oumedjeber, we're presenting our Master's thesis: "The Role of Weather in French Day-Ahead Electricity Price Forecasting." I'll cover the first half, then hand over to Lyam.</w:t>
+        <w:t>Good morning, Professor.</w:t>
       </w:r>
     </w:p>
     <w:p>
       <w:pPr>
-        <w:spacing w:before="40" w:after="40"/>
-        <w:pBdr>
-          <w:bottom w:val="single" w:sz="4" w:space="1" w:color="CCCCCC"/>
-        </w:pBdr>
+        <w:spacing w:before="0" w:after="0"/>
       </w:pPr>
     </w:p>
     <w:p>
       <w:pPr>
-        <w:spacing w:before="280" w:after="60"/>
+        <w:spacing w:before="0" w:after="120"/>
+        <w:ind w:left="283"/>
+      </w:pPr>
+      <w:r>
+        <w:rPr>
+          <w:b w:val="0"/>
+          <w:i w:val="0"/>
+          <w:sz w:val="24"/>
+        </w:rPr>
+        <w:t>I'm Leo — with Lyam, we spent the last year asking a very specific question about the French electricity market.</w:t>
+      </w:r>
+    </w:p>
+    <w:p>
+      <w:pPr>
+        <w:spacing w:before="0" w:after="0"/>
+      </w:pPr>
+    </w:p>
+    <w:p>
+      <w:pPr>
+        <w:spacing w:before="0" w:after="120"/>
+        <w:ind w:left="283"/>
+      </w:pPr>
+      <w:r>
+        <w:rPr>
+          <w:b w:val="0"/>
+          <w:i w:val="0"/>
+          <w:sz w:val="24"/>
+        </w:rPr>
+        <w:t>I'll set it up, and Lyam will deliver the punchline.</w:t>
+      </w:r>
+    </w:p>
+    <w:p>
+      <w:pPr>
+        <w:spacing w:before="120" w:after="120"/>
+        <w:pBdr>
+          <w:bottom w:val="single" w:sz="4" w:space="4" w:color="CCCCCC"/>
+        </w:pBdr>
+      </w:pPr>
+    </w:p>
+    <w:p>
+      <w:pPr>
+        <w:spacing w:before="320" w:after="80"/>
+        <w:pBdr>
+          <w:bottom w:val="single" w:sz="4" w:space="4" w:color="C8A032"/>
+        </w:pBdr>
       </w:pPr>
       <w:r>
         <w:rPr>
@@ -140,7 +195,7 @@
         <w:rPr>
           <w:b w:val="0"/>
           <w:i/>
-          <w:color w:val="555555"/>
+          <w:color w:val="666666"/>
           <w:sz w:val="22"/>
         </w:rPr>
         <w:t xml:space="preserve">  · ~1 min 30 s</w:t>
@@ -148,85 +203,127 @@
     </w:p>
     <w:p>
       <w:pPr>
-        <w:spacing w:before="0" w:after="80"/>
-        <w:ind w:left="227"/>
+        <w:spacing w:before="0" w:after="120"/>
+        <w:ind w:left="283"/>
       </w:pPr>
       <w:r>
         <w:rPr>
           <w:b w:val="0"/>
           <w:i w:val="0"/>
-          <w:color w:val="212529"/>
+          <w:sz w:val="24"/>
         </w:rPr>
-        <w:t>Why forecast French electricity prices — and why might weather help?</w:t>
+        <w:t>Before we get into the method — why does this market in particular make the question interesting?</w:t>
       </w:r>
     </w:p>
     <w:p>
       <w:pPr>
-        <w:spacing w:before="0" w:after="80"/>
-        <w:ind w:left="227"/>
+        <w:spacing w:before="0" w:after="0"/>
+      </w:pPr>
+    </w:p>
+    <w:p>
+      <w:pPr>
+        <w:spacing w:before="0" w:after="120"/>
+        <w:ind w:left="283"/>
       </w:pPr>
       <w:r>
         <w:rPr>
           <w:b w:val="0"/>
           <w:i w:val="0"/>
-          <w:color w:val="212529"/>
+          <w:sz w:val="24"/>
         </w:rPr>
-        <w:t>First: electricity can't be stored. Supply and demand balance every hour, creating extreme volatility — prices can spike to several thousand euros per megawatt-hour.</w:t>
+        <w:t>Three things make France unusual.</w:t>
       </w:r>
     </w:p>
     <w:p>
       <w:pPr>
-        <w:spacing w:before="0" w:after="80"/>
-        <w:ind w:left="227"/>
+        <w:spacing w:before="0" w:after="0"/>
+      </w:pPr>
+    </w:p>
+    <w:p>
+      <w:pPr>
+        <w:spacing w:before="0" w:after="120"/>
+        <w:ind w:left="283"/>
       </w:pPr>
       <w:r>
         <w:rPr>
           <w:b w:val="0"/>
           <w:i w:val="0"/>
-          <w:color w:val="212529"/>
+          <w:sz w:val="24"/>
         </w:rPr>
-        <w:t>Second: France is unique. Around 70% of output is nuclear, and because heating is mostly electric, a one-degree temperature drop adds about 2.4 gigawatts of demand — the highest thermosensitivity in Europe.</w:t>
+        <w:t>Electricity can't be stored — so every mismatch between supply and demand shows up immediately in the price. That's why you get these violent spikes. It's structurally different from any financial market.</w:t>
       </w:r>
     </w:p>
     <w:p>
       <w:pPr>
-        <w:spacing w:before="0" w:after="80"/>
-        <w:ind w:left="227"/>
+        <w:spacing w:before="0" w:after="0"/>
+      </w:pPr>
+    </w:p>
+    <w:p>
+      <w:pPr>
+        <w:spacing w:before="0" w:after="120"/>
+        <w:ind w:left="283"/>
       </w:pPr>
       <w:r>
         <w:rPr>
           <w:b w:val="0"/>
           <w:i w:val="0"/>
-          <w:color w:val="212529"/>
+          <w:sz w:val="24"/>
         </w:rPr>
-        <w:t>Third: the stakes are real. A one-euro improvement on a 100-megawatt book is worth about 876,000 euros per year.</w:t>
+        <w:t>France adds a layer on top: 70% nuclear, and most heating is electric. So a cold snap doesn't just increase demand — it hits a system with very little flexibility. 2.4 gigawatts per degree. The highest in Europe.</w:t>
       </w:r>
     </w:p>
     <w:p>
       <w:pPr>
-        <w:spacing w:before="0" w:after="80"/>
-        <w:ind w:left="227"/>
+        <w:spacing w:before="0" w:after="0"/>
+      </w:pPr>
+    </w:p>
+    <w:p>
+      <w:pPr>
+        <w:spacing w:before="0" w:after="120"/>
+        <w:ind w:left="283"/>
       </w:pPr>
       <w:r>
         <w:rPr>
           <w:b w:val="0"/>
           <w:i w:val="0"/>
-          <w:color w:val="212529"/>
+          <w:sz w:val="24"/>
         </w:rPr>
-        <w:t>The question is: does weather actually help — or is that signal already captured by other variables?</w:t>
+        <w:t>And the practical reason we care: a one-euro improvement in forecast accuracy on a typical trading book is close to a million euros a year.</w:t>
       </w:r>
     </w:p>
     <w:p>
       <w:pPr>
-        <w:spacing w:before="40" w:after="40"/>
-        <w:pBdr>
-          <w:bottom w:val="single" w:sz="4" w:space="1" w:color="CCCCCC"/>
-        </w:pBdr>
+        <w:spacing w:before="0" w:after="0"/>
       </w:pPr>
     </w:p>
     <w:p>
       <w:pPr>
-        <w:spacing w:before="280" w:after="60"/>
+        <w:spacing w:before="0" w:after="120"/>
+        <w:ind w:left="283"/>
+      </w:pPr>
+      <w:r>
+        <w:rPr>
+          <w:b w:val="0"/>
+          <w:i w:val="0"/>
+          <w:sz w:val="24"/>
+        </w:rPr>
+        <w:t>So the question is: where does that improvement come from? Is weather one of the answers?</w:t>
+      </w:r>
+    </w:p>
+    <w:p>
+      <w:pPr>
+        <w:spacing w:before="120" w:after="120"/>
+        <w:pBdr>
+          <w:bottom w:val="single" w:sz="4" w:space="4" w:color="CCCCCC"/>
+        </w:pBdr>
+      </w:pPr>
+    </w:p>
+    <w:p>
+      <w:pPr>
+        <w:spacing w:before="320" w:after="80"/>
+        <w:pBdr>
+          <w:bottom w:val="single" w:sz="4" w:space="4" w:color="C8A032"/>
+        </w:pBdr>
       </w:pPr>
       <w:r>
         <w:rPr>
@@ -250,7 +347,7 @@
         <w:rPr>
           <w:b w:val="0"/>
           <w:i/>
-          <w:color w:val="555555"/>
+          <w:color w:val="666666"/>
           <w:sz w:val="22"/>
         </w:rPr>
         <w:t xml:space="preserve">  · ~1 min</w:t>
@@ -258,57 +355,89 @@
     </w:p>
     <w:p>
       <w:pPr>
-        <w:spacing w:before="0" w:after="80"/>
-        <w:ind w:left="227"/>
+        <w:spacing w:before="0" w:after="120"/>
+        <w:ind w:left="283"/>
       </w:pPr>
       <w:r>
         <w:rPr>
           <w:b w:val="0"/>
           <w:i w:val="0"/>
-          <w:color w:val="212529"/>
+          <w:sz w:val="24"/>
         </w:rPr>
-        <w:t>We structured the thesis around four sub-questions.</w:t>
+        <w:t>The question in the box is the one we set out to answer.</w:t>
       </w:r>
     </w:p>
     <w:p>
       <w:pPr>
-        <w:spacing w:before="0" w:after="80"/>
-        <w:ind w:left="227"/>
+        <w:spacing w:before="0" w:after="0"/>
+      </w:pPr>
+    </w:p>
+    <w:p>
+      <w:pPr>
+        <w:spacing w:before="0" w:after="120"/>
+        <w:ind w:left="283"/>
       </w:pPr>
       <w:r>
         <w:rPr>
           <w:b w:val="0"/>
           <w:i w:val="0"/>
-          <w:color w:val="212529"/>
+          <w:sz w:val="24"/>
         </w:rPr>
-        <w:t>Can machine learning beat a naïve statistical benchmark? Do weather features add significant value beyond fundamentals alone? Does that value change between a stable market and a crisis — and why? And do better forecasts translate into real trading profit?</w:t>
+        <w:t>But we didn't treat it as a yes/no. We broke it into four parts — you can see them on the slide.</w:t>
       </w:r>
     </w:p>
     <w:p>
       <w:pPr>
-        <w:spacing w:before="0" w:after="80"/>
-        <w:ind w:left="227"/>
+        <w:spacing w:before="0" w:after="0"/>
+      </w:pPr>
+    </w:p>
+    <w:p>
+      <w:pPr>
+        <w:spacing w:before="0" w:after="120"/>
+        <w:ind w:left="283"/>
       </w:pPr>
       <w:r>
         <w:rPr>
           <w:b w:val="0"/>
           <w:i w:val="0"/>
-          <w:color w:val="212529"/>
+          <w:sz w:val="24"/>
         </w:rPr>
-        <w:t>These four questions map directly onto the slides ahead.</w:t>
+        <w:t>The first two are about forecast accuracy. The third — does the answer change depending on what the market is doing — is the one that turned out to be most interesting. The fourth connects it to something concrete: money.</w:t>
       </w:r>
     </w:p>
     <w:p>
       <w:pPr>
-        <w:spacing w:before="40" w:after="40"/>
-        <w:pBdr>
-          <w:bottom w:val="single" w:sz="4" w:space="1" w:color="CCCCCC"/>
-        </w:pBdr>
+        <w:spacing w:before="0" w:after="0"/>
       </w:pPr>
     </w:p>
     <w:p>
       <w:pPr>
-        <w:spacing w:before="280" w:after="60"/>
+        <w:spacing w:before="0" w:after="120"/>
+        <w:ind w:left="283"/>
+      </w:pPr>
+      <w:r>
+        <w:rPr>
+          <w:b w:val="0"/>
+          <w:i w:val="0"/>
+          <w:sz w:val="24"/>
+        </w:rPr>
+        <w:t>Those four questions are the backbone of everything that follows.</w:t>
+      </w:r>
+    </w:p>
+    <w:p>
+      <w:pPr>
+        <w:spacing w:before="120" w:after="120"/>
+        <w:pBdr>
+          <w:bottom w:val="single" w:sz="4" w:space="4" w:color="CCCCCC"/>
+        </w:pBdr>
+      </w:pPr>
+    </w:p>
+    <w:p>
+      <w:pPr>
+        <w:spacing w:before="320" w:after="80"/>
+        <w:pBdr>
+          <w:bottom w:val="single" w:sz="4" w:space="4" w:color="C8A032"/>
+        </w:pBdr>
       </w:pPr>
       <w:r>
         <w:rPr>
@@ -332,7 +461,7 @@
         <w:rPr>
           <w:b w:val="0"/>
           <w:i/>
-          <w:color w:val="555555"/>
+          <w:color w:val="666666"/>
           <w:sz w:val="22"/>
         </w:rPr>
         <w:t xml:space="preserve">  · ~1 min</w:t>
@@ -340,57 +469,70 @@
     </w:p>
     <w:p>
       <w:pPr>
-        <w:spacing w:before="0" w:after="80"/>
-        <w:ind w:left="227"/>
+        <w:spacing w:before="0" w:after="120"/>
+        <w:ind w:left="283"/>
       </w:pPr>
       <w:r>
         <w:rPr>
           <w:b w:val="0"/>
           <w:i w:val="0"/>
-          <w:color w:val="212529"/>
+          <w:sz w:val="24"/>
         </w:rPr>
-        <w:t>Our dataset covers January 2018 to April 2025 — around 64,000 hourly observations from four public sources.</w:t>
+        <w:t>On the left, the four data sources — nothing exotic, all public.</w:t>
       </w:r>
     </w:p>
     <w:p>
       <w:pPr>
-        <w:spacing w:before="0" w:after="80"/>
-        <w:ind w:left="227"/>
+        <w:spacing w:before="0" w:after="0"/>
+      </w:pPr>
+    </w:p>
+    <w:p>
+      <w:pPr>
+        <w:spacing w:before="0" w:after="120"/>
+        <w:ind w:left="283"/>
       </w:pPr>
       <w:r>
         <w:rPr>
           <w:b w:val="0"/>
           <w:i w:val="0"/>
-          <w:color w:val="212529"/>
+          <w:sz w:val="24"/>
         </w:rPr>
-        <w:t>ENTSO-E for prices, load forecast, generation, and cross-border flows. ERA5 from ECMWF for weather — temperature, wind, solar, precipitation. TTF gas and ARA coal for fuel prices. In total, 35 engineered features.</w:t>
+        <w:t>The interesting one is ERA5. It's not a weather forecast — it's a reanalysis. ECMWF takes actual observations and reconstructs the best possible version of past weather. We'll come back to why that distinction matters.</w:t>
       </w:r>
     </w:p>
     <w:p>
       <w:pPr>
-        <w:spacing w:before="0" w:after="80"/>
-        <w:ind w:left="227"/>
+        <w:spacing w:before="0" w:after="0"/>
+      </w:pPr>
+    </w:p>
+    <w:p>
+      <w:pPr>
+        <w:spacing w:before="0" w:after="120"/>
+        <w:ind w:left="283"/>
       </w:pPr>
       <w:r>
         <w:rPr>
           <w:b w:val="0"/>
           <w:i w:val="0"/>
-          <w:color w:val="212529"/>
+          <w:sz w:val="24"/>
         </w:rPr>
-        <w:t>One key point: the data spans three very different regimes — pre-crisis, the 2022 energy crisis where prices briefly exceeded 1,000 euros, and post-crisis normalisation. That heterogeneity is central to our results.</w:t>
+        <w:t>The chart on the right is worth a look before we go further. Three periods: the flat pre-crisis years, the 2022 spike above 1,000 euros, then the return to normal. That's not just context — it's the core of our experiment.</w:t>
       </w:r>
     </w:p>
     <w:p>
       <w:pPr>
-        <w:spacing w:before="40" w:after="40"/>
+        <w:spacing w:before="120" w:after="120"/>
         <w:pBdr>
-          <w:bottom w:val="single" w:sz="4" w:space="1" w:color="CCCCCC"/>
+          <w:bottom w:val="single" w:sz="4" w:space="4" w:color="CCCCCC"/>
         </w:pBdr>
       </w:pPr>
     </w:p>
     <w:p>
       <w:pPr>
-        <w:spacing w:before="280" w:after="60"/>
+        <w:spacing w:before="320" w:after="80"/>
+        <w:pBdr>
+          <w:bottom w:val="single" w:sz="4" w:space="4" w:color="C8A032"/>
+        </w:pBdr>
       </w:pPr>
       <w:r>
         <w:rPr>
@@ -414,7 +556,7 @@
         <w:rPr>
           <w:b w:val="0"/>
           <w:i/>
-          <w:color w:val="555555"/>
+          <w:color w:val="666666"/>
           <w:sz w:val="22"/>
         </w:rPr>
         <w:t xml:space="preserve">  · ~1 min</w:t>
@@ -422,57 +564,89 @@
     </w:p>
     <w:p>
       <w:pPr>
-        <w:spacing w:before="0" w:after="80"/>
-        <w:ind w:left="227"/>
+        <w:spacing w:before="0" w:after="120"/>
+        <w:ind w:left="283"/>
       </w:pPr>
       <w:r>
         <w:rPr>
           <w:b w:val="0"/>
           <w:i w:val="0"/>
-          <w:color w:val="212529"/>
+          <w:sz w:val="24"/>
         </w:rPr>
-        <w:t>We used a four-model ablation design.</w:t>
+        <w:t>The design is simple — and deliberately so.</w:t>
       </w:r>
     </w:p>
     <w:p>
       <w:pPr>
-        <w:spacing w:before="0" w:after="80"/>
-        <w:ind w:left="227"/>
+        <w:spacing w:before="0" w:after="0"/>
+      </w:pPr>
+    </w:p>
+    <w:p>
+      <w:pPr>
+        <w:spacing w:before="0" w:after="120"/>
+        <w:ind w:left="283"/>
       </w:pPr>
       <w:r>
         <w:rPr>
           <w:b w:val="0"/>
           <w:i w:val="0"/>
-          <w:color w:val="212529"/>
+          <w:sz w:val="24"/>
         </w:rPr>
-        <w:t>Model A is the naïve benchmark: the price from the same hour last week. Model B is a Random Forest on 27 features — no weather. Model C is our main model: Random Forest with all 35 features including weather. Model D is XGBoost with the same 35 features.</w:t>
+        <w:t>Four models. One controlled comparison.</w:t>
       </w:r>
     </w:p>
     <w:p>
       <w:pPr>
-        <w:spacing w:before="0" w:after="80"/>
-        <w:ind w:left="227"/>
+        <w:spacing w:before="0" w:after="0"/>
+      </w:pPr>
+    </w:p>
+    <w:p>
+      <w:pPr>
+        <w:spacing w:before="0" w:after="120"/>
+        <w:ind w:left="283"/>
       </w:pPr>
       <w:r>
         <w:rPr>
           <w:b w:val="0"/>
           <w:i w:val="0"/>
-          <w:color w:val="212529"/>
+          <w:sz w:val="24"/>
         </w:rPr>
-        <w:t>The key comparison is C versus B: same architecture, same data — only the weather features differ. This isolates weather's marginal contribution, tested out-of-sample with the Diebold-Mariano test.</w:t>
+        <w:t>B and C are identical in every way except one: C gets the weather variables, B doesn't. That's the ablation. If C is better than B, weather helped. If not, the signal was already there without it.</w:t>
       </w:r>
     </w:p>
     <w:p>
       <w:pPr>
-        <w:spacing w:before="40" w:after="40"/>
-        <w:pBdr>
-          <w:bottom w:val="single" w:sz="4" w:space="1" w:color="CCCCCC"/>
-        </w:pBdr>
+        <w:spacing w:before="0" w:after="0"/>
       </w:pPr>
     </w:p>
     <w:p>
       <w:pPr>
-        <w:spacing w:before="280" w:after="60"/>
+        <w:spacing w:before="0" w:after="120"/>
+        <w:ind w:left="283"/>
+      </w:pPr>
+      <w:r>
+        <w:rPr>
+          <w:b w:val="0"/>
+          <w:i w:val="0"/>
+          <w:sz w:val="24"/>
+        </w:rPr>
+        <w:t>We test that difference formally with the Diebold-Mariano test — the standard in this literature for comparing forecast accuracy.</w:t>
+      </w:r>
+    </w:p>
+    <w:p>
+      <w:pPr>
+        <w:spacing w:before="120" w:after="120"/>
+        <w:pBdr>
+          <w:bottom w:val="single" w:sz="4" w:space="4" w:color="CCCCCC"/>
+        </w:pBdr>
+      </w:pPr>
+    </w:p>
+    <w:p>
+      <w:pPr>
+        <w:spacing w:before="320" w:after="80"/>
+        <w:pBdr>
+          <w:bottom w:val="single" w:sz="4" w:space="4" w:color="C8A032"/>
+        </w:pBdr>
       </w:pPr>
       <w:r>
         <w:rPr>
@@ -496,7 +670,7 @@
         <w:rPr>
           <w:b w:val="0"/>
           <w:i/>
-          <w:color w:val="555555"/>
+          <w:color w:val="666666"/>
           <w:sz w:val="22"/>
         </w:rPr>
         <w:t xml:space="preserve">  · ~1 min 30 s</w:t>
@@ -504,71 +678,109 @@
     </w:p>
     <w:p>
       <w:pPr>
-        <w:spacing w:before="0" w:after="80"/>
-        <w:ind w:left="227"/>
+        <w:spacing w:before="0" w:after="120"/>
+        <w:ind w:left="283"/>
       </w:pPr>
       <w:r>
         <w:rPr>
           <w:b w:val="0"/>
           <w:i w:val="0"/>
-          <w:color w:val="212529"/>
+          <w:sz w:val="24"/>
         </w:rPr>
-        <w:t>On the stable test period — May 2024 to April 2025, 8,640 observations — the naïve benchmark gives a MAE of 33 euros and an R-squared of 0.16.</w:t>
+        <w:t>Look at the table — specifically the last two rows.</w:t>
       </w:r>
     </w:p>
     <w:p>
       <w:pPr>
-        <w:spacing w:before="0" w:after="80"/>
-        <w:ind w:left="227"/>
+        <w:spacing w:before="0" w:after="0"/>
+      </w:pPr>
+    </w:p>
+    <w:p>
+      <w:pPr>
+        <w:spacing w:before="0" w:after="120"/>
+        <w:ind w:left="283"/>
       </w:pPr>
       <w:r>
         <w:rPr>
           <w:b w:val="0"/>
           <w:i w:val="0"/>
-          <w:color w:val="212529"/>
+          <w:sz w:val="24"/>
         </w:rPr>
-        <w:t>Both Random Forest models cut that error by 49%, bringing MAE to 16.9 euros and R-squared to 0.78.</w:t>
+        <w:t>B and C. 16.95 and 16.94. One hundredth of a euro difference. On a baseline of 33 euros, that's noise.</w:t>
       </w:r>
     </w:p>
     <w:p>
       <w:pPr>
-        <w:spacing w:before="0" w:after="80"/>
-        <w:ind w:left="227"/>
+        <w:spacing w:before="0" w:after="0"/>
+      </w:pPr>
+    </w:p>
+    <w:p>
+      <w:pPr>
+        <w:spacing w:before="0" w:after="120"/>
+        <w:ind w:left="283"/>
       </w:pPr>
       <w:r>
         <w:rPr>
           <w:b w:val="0"/>
           <w:i w:val="0"/>
-          <w:color w:val="212529"/>
+          <w:sz w:val="24"/>
         </w:rPr>
-        <w:t>Now the critical number: Model C with weather, 16.94. Model B without weather, 16.95. One hundredth of a euro. XGBoost underperforms at 19.14.</w:t>
+        <w:t>Now look at A versus B — 33 down to 16.9. That's the machine learning contribution. That's real.</w:t>
       </w:r>
     </w:p>
     <w:p>
       <w:pPr>
-        <w:spacing w:before="0" w:after="80"/>
-        <w:ind w:left="227"/>
+        <w:spacing w:before="0" w:after="0"/>
+      </w:pPr>
+    </w:p>
+    <w:p>
+      <w:pPr>
+        <w:spacing w:before="0" w:after="120"/>
+        <w:ind w:left="283"/>
       </w:pPr>
       <w:r>
         <w:rPr>
           <w:b w:val="0"/>
           <w:i w:val="0"/>
-          <w:color w:val="212529"/>
+          <w:sz w:val="24"/>
         </w:rPr>
-        <w:t>Machine learning clearly works — but weather, in this regime, adds essentially nothing.</w:t>
+        <w:t>XGBoost underperforms here — we'll explain why that's actually informative.</w:t>
       </w:r>
     </w:p>
     <w:p>
       <w:pPr>
-        <w:spacing w:before="40" w:after="40"/>
-        <w:pBdr>
-          <w:bottom w:val="single" w:sz="4" w:space="1" w:color="CCCCCC"/>
-        </w:pBdr>
+        <w:spacing w:before="0" w:after="0"/>
       </w:pPr>
     </w:p>
     <w:p>
       <w:pPr>
-        <w:spacing w:before="280" w:after="60"/>
+        <w:spacing w:before="40" w:after="120"/>
+        <w:ind w:left="283"/>
+      </w:pPr>
+      <w:r>
+        <w:rPr>
+          <w:b/>
+          <w:i w:val="0"/>
+          <w:color w:val="002255"/>
+          <w:sz w:val="24"/>
+        </w:rPr>
+        <w:t>But the headline: weather, in a calm market, doesn't move the needle.</w:t>
+      </w:r>
+    </w:p>
+    <w:p>
+      <w:pPr>
+        <w:spacing w:before="120" w:after="120"/>
+        <w:pBdr>
+          <w:bottom w:val="single" w:sz="4" w:space="4" w:color="CCCCCC"/>
+        </w:pBdr>
+      </w:pPr>
+    </w:p>
+    <w:p>
+      <w:pPr>
+        <w:spacing w:before="320" w:after="80"/>
+        <w:pBdr>
+          <w:bottom w:val="single" w:sz="4" w:space="4" w:color="C8A032"/>
+        </w:pBdr>
       </w:pPr>
       <w:r>
         <w:rPr>
@@ -592,7 +804,7 @@
         <w:rPr>
           <w:b w:val="0"/>
           <w:i/>
-          <w:color w:val="555555"/>
+          <w:color w:val="666666"/>
           <w:sz w:val="22"/>
         </w:rPr>
         <w:t xml:space="preserve">  · ~1 min</w:t>
@@ -600,72 +812,109 @@
     </w:p>
     <w:p>
       <w:pPr>
-        <w:spacing w:before="0" w:after="80"/>
-        <w:ind w:left="227"/>
+        <w:spacing w:before="0" w:after="120"/>
+        <w:ind w:left="283"/>
       </w:pPr>
       <w:r>
         <w:rPr>
           <w:b w:val="0"/>
           <w:i w:val="0"/>
-          <w:color w:val="212529"/>
+          <w:sz w:val="24"/>
         </w:rPr>
-        <w:t>The statistical test confirms it. The Diebold-Mariano test for C versus B gives p = 0.572 — not significant.</w:t>
+        <w:t>This slide formalises what we just saw.</w:t>
       </w:r>
     </w:p>
     <w:p>
       <w:pPr>
-        <w:spacing w:before="0" w:after="80"/>
-        <w:ind w:left="227"/>
+        <w:spacing w:before="0" w:after="0"/>
+      </w:pPr>
+    </w:p>
+    <w:p>
+      <w:pPr>
+        <w:spacing w:before="0" w:after="120"/>
+        <w:ind w:left="283"/>
       </w:pPr>
       <w:r>
         <w:rPr>
           <w:b w:val="0"/>
           <w:i w:val="0"/>
-          <w:color w:val="212529"/>
+          <w:sz w:val="24"/>
         </w:rPr>
-        <w:t>But test either RF model against the naïve benchmark, and the DM statistic is around minus 53, with p below 0.001. Machine learning adds massive, unambiguous value. Weather does not — in this regime.</w:t>
+        <w:t>The top line — p = 0.572. We fail to reject equal accuracy between C and B. Weather is not statistically significant in the stable regime.</w:t>
       </w:r>
     </w:p>
     <w:p>
       <w:pPr>
-        <w:spacing w:before="0" w:after="80"/>
-        <w:ind w:left="227"/>
+        <w:spacing w:before="0" w:after="0"/>
+      </w:pPr>
+    </w:p>
+    <w:p>
+      <w:pPr>
+        <w:spacing w:before="0" w:after="120"/>
+        <w:ind w:left="283"/>
       </w:pPr>
       <w:r>
         <w:rPr>
           <w:b w:val="0"/>
           <w:i w:val="0"/>
-          <w:color w:val="212529"/>
+          <w:sz w:val="24"/>
         </w:rPr>
-        <w:t>Why? And is it always the case? I hand over to Lyam.</w:t>
+        <w:t>Now look at the other rows. When we test ML against the naïve benchmark, the DM statistic is minus 53. That's enormous — essentially impossible to get by chance.</w:t>
       </w:r>
     </w:p>
     <w:p>
       <w:pPr>
-        <w:spacing w:before="40" w:after="40"/>
-        <w:ind w:left="227"/>
+        <w:spacing w:before="0" w:after="0"/>
+      </w:pPr>
+    </w:p>
+    <w:p>
+      <w:pPr>
+        <w:spacing w:before="0" w:after="120"/>
+        <w:ind w:left="283"/>
+      </w:pPr>
+      <w:r>
+        <w:rPr>
+          <w:b w:val="0"/>
+          <w:i w:val="0"/>
+          <w:sz w:val="24"/>
+        </w:rPr>
+        <w:t>So we have two very different stories in the same table: ML adds unambiguous value. Weather, right now, does not.</w:t>
+      </w:r>
+    </w:p>
+    <w:p>
+      <w:pPr>
+        <w:spacing w:before="0" w:after="0"/>
+      </w:pPr>
+    </w:p>
+    <w:p>
+      <w:pPr>
+        <w:spacing w:before="80" w:after="120"/>
+        <w:ind w:left="283"/>
       </w:pPr>
       <w:r>
         <w:rPr>
           <w:b w:val="0"/>
           <w:i/>
-          <w:color w:val="555555"/>
-          <w:sz w:val="20"/>
+          <w:color w:val="666666"/>
+          <w:sz w:val="22"/>
         </w:rPr>
-        <w:t>→  "I'll hand over to Lyam, who will explain the mechanism and then show what happens in the 2022 crisis."</w:t>
+        <w:t>"Lyam will take it from here."</w:t>
       </w:r>
     </w:p>
     <w:p>
       <w:pPr>
-        <w:spacing w:before="40" w:after="40"/>
+        <w:spacing w:before="120" w:after="120"/>
         <w:pBdr>
-          <w:bottom w:val="single" w:sz="4" w:space="1" w:color="CCCCCC"/>
+          <w:bottom w:val="single" w:sz="4" w:space="4" w:color="CCCCCC"/>
         </w:pBdr>
       </w:pPr>
     </w:p>
     <w:p>
       <w:pPr>
-        <w:spacing w:before="280" w:after="60"/>
+        <w:spacing w:before="320" w:after="80"/>
+        <w:pBdr>
+          <w:bottom w:val="single" w:sz="4" w:space="4" w:color="C8A032"/>
+        </w:pBdr>
       </w:pPr>
       <w:r>
         <w:rPr>
@@ -689,7 +938,7 @@
         <w:rPr>
           <w:b w:val="0"/>
           <w:i/>
-          <w:color w:val="555555"/>
+          <w:color w:val="666666"/>
           <w:sz w:val="22"/>
         </w:rPr>
         <w:t xml:space="preserve">  · ~1 min</w:t>
@@ -697,57 +946,89 @@
     </w:p>
     <w:p>
       <w:pPr>
-        <w:spacing w:before="0" w:after="80"/>
-        <w:ind w:left="227"/>
+        <w:spacing w:before="0" w:after="120"/>
+        <w:ind w:left="283"/>
       </w:pPr>
       <w:r>
         <w:rPr>
           <w:b w:val="0"/>
           <w:i w:val="0"/>
-          <w:color w:val="212529"/>
+          <w:sz w:val="24"/>
         </w:rPr>
-        <w:t>Thank you, Leo. The feature importance chart explains why weather is redundant.</w:t>
+        <w:t>Thanks Leo. This chart answers the "why" before I even state it.</w:t>
       </w:r>
     </w:p>
     <w:p>
       <w:pPr>
-        <w:spacing w:before="0" w:after="80"/>
-        <w:ind w:left="227"/>
+        <w:spacing w:before="0" w:after="0"/>
+      </w:pPr>
+    </w:p>
+    <w:p>
+      <w:pPr>
+        <w:spacing w:before="0" w:after="120"/>
+        <w:ind w:left="283"/>
       </w:pPr>
       <w:r>
         <w:rPr>
           <w:b w:val="0"/>
           <w:i w:val="0"/>
-          <w:color w:val="212529"/>
+          <w:sz w:val="24"/>
         </w:rPr>
-        <w:t>Price lags dominate: the 24-hour lag alone contributes 21% of importance, and lags plus rolling means account for about 70%. Then fuel prices: TTF gas 8%, ARA coal 6%, nuclear availability 2%. All weather variables combined: just 2.2%.</w:t>
+        <w:t>Look at the bar lengths. The top five features are all price lags and rolling averages. Price history explains about 70% of what the model knows.</w:t>
       </w:r>
     </w:p>
     <w:p>
       <w:pPr>
-        <w:spacing w:before="0" w:after="80"/>
-        <w:ind w:left="227"/>
+        <w:spacing w:before="0" w:after="0"/>
+      </w:pPr>
+    </w:p>
+    <w:p>
+      <w:pPr>
+        <w:spacing w:before="0" w:after="120"/>
+        <w:ind w:left="283"/>
       </w:pPr>
       <w:r>
         <w:rPr>
           <w:b w:val="0"/>
           <w:i w:val="0"/>
-          <w:color w:val="212529"/>
+          <w:sz w:val="24"/>
         </w:rPr>
-        <w:t>Weather's signal is already captured by other features — the next slide explains exactly how.</w:t>
+        <w:t>Weather sits at the bottom. All variables combined — temperature, wind, solar, everything — about 2%.</w:t>
       </w:r>
     </w:p>
     <w:p>
       <w:pPr>
-        <w:spacing w:before="40" w:after="40"/>
-        <w:pBdr>
-          <w:bottom w:val="single" w:sz="4" w:space="1" w:color="CCCCCC"/>
-        </w:pBdr>
+        <w:spacing w:before="0" w:after="0"/>
       </w:pPr>
     </w:p>
     <w:p>
       <w:pPr>
-        <w:spacing w:before="280" w:after="60"/>
+        <w:spacing w:before="0" w:after="120"/>
+        <w:ind w:left="283"/>
+      </w:pPr>
+      <w:r>
+        <w:rPr>
+          <w:b w:val="0"/>
+          <w:i w:val="0"/>
+          <w:sz w:val="24"/>
+        </w:rPr>
+        <w:t>That's not a modelling flaw. It's telling us something real: weather's signal is already in the data — just encoded differently.</w:t>
+      </w:r>
+    </w:p>
+    <w:p>
+      <w:pPr>
+        <w:spacing w:before="120" w:after="120"/>
+        <w:pBdr>
+          <w:bottom w:val="single" w:sz="4" w:space="4" w:color="CCCCCC"/>
+        </w:pBdr>
+      </w:pPr>
+    </w:p>
+    <w:p>
+      <w:pPr>
+        <w:spacing w:before="320" w:after="80"/>
+        <w:pBdr>
+          <w:bottom w:val="single" w:sz="4" w:space="4" w:color="C8A032"/>
+        </w:pBdr>
       </w:pPr>
       <w:r>
         <w:rPr>
@@ -771,7 +1052,7 @@
         <w:rPr>
           <w:b w:val="0"/>
           <w:i/>
-          <w:color w:val="555555"/>
+          <w:color w:val="666666"/>
           <w:sz w:val="22"/>
         </w:rPr>
         <w:t xml:space="preserve">  · ~1 min 30 s</w:t>
@@ -779,100 +1060,109 @@
     </w:p>
     <w:p>
       <w:pPr>
-        <w:spacing w:before="0" w:after="80"/>
-        <w:ind w:left="227"/>
+        <w:spacing w:before="0" w:after="120"/>
+        <w:ind w:left="283"/>
       </w:pPr>
       <w:r>
         <w:rPr>
           <w:b w:val="0"/>
           <w:i w:val="0"/>
-          <w:color w:val="212529"/>
+          <w:sz w:val="24"/>
         </w:rPr>
-        <w:t>We call this the Information Redundancy Hypothesis. Three channels explain it.</w:t>
+        <w:t>Three boxes on this slide — three reasons why weather is redundant.</w:t>
       </w:r>
     </w:p>
     <w:p>
       <w:pPr>
-        <w:spacing w:before="0" w:after="80"/>
-        <w:ind w:left="227"/>
+        <w:spacing w:before="0" w:after="0"/>
+      </w:pPr>
+    </w:p>
+    <w:p>
+      <w:pPr>
+        <w:spacing w:before="0" w:after="120"/>
+        <w:ind w:left="283"/>
       </w:pPr>
       <w:r>
         <w:rPr>
           <w:b w:val="0"/>
           <w:i w:val="0"/>
-          <w:color w:val="212529"/>
+          <w:sz w:val="24"/>
         </w:rPr>
-        <w:t>One: the RTE load forecast is built on temperature data. Including it means the model is already conditioning on weather-driven demand. Raw temperature adds nothing new.</w:t>
+        <w:t>The first one is the most elegant. RTE publishes a load forecast every morning — and that forecast is built using temperature data. So when our model sees the load forecast, it's already implicitly seeing the weather. Adding raw temperature on top of that adds nothing.</w:t>
       </w:r>
     </w:p>
     <w:p>
       <w:pPr>
-        <w:spacing w:before="0" w:after="80"/>
-        <w:ind w:left="227"/>
+        <w:spacing w:before="0" w:after="0"/>
+      </w:pPr>
+    </w:p>
+    <w:p>
+      <w:pPr>
+        <w:spacing w:before="0" w:after="120"/>
+        <w:ind w:left="283"/>
       </w:pPr>
       <w:r>
         <w:rPr>
           <w:b w:val="0"/>
           <w:i w:val="0"/>
-          <w:color w:val="212529"/>
+          <w:sz w:val="24"/>
         </w:rPr>
-        <w:t>Two: TTF gas prices aggregate pan-European heating demand. When it's cold across Europe, gas demand rises, TTF rises. The commodity market does the weather encoding for us.</w:t>
+        <w:t>The second: TTF gas prices. Gas is the marginal fuel in Europe. When it's cold everywhere, TTF rises. The commodity market has already aggregated the weather signal for us.</w:t>
       </w:r>
     </w:p>
     <w:p>
       <w:pPr>
-        <w:spacing w:before="0" w:after="80"/>
-        <w:ind w:left="227"/>
+        <w:spacing w:before="0" w:after="0"/>
+      </w:pPr>
+    </w:p>
+    <w:p>
+      <w:pPr>
+        <w:spacing w:before="0" w:after="120"/>
+        <w:ind w:left="283"/>
       </w:pPr>
       <w:r>
         <w:rPr>
           <w:b w:val="0"/>
           <w:i w:val="0"/>
-          <w:color w:val="212529"/>
+          <w:sz w:val="24"/>
         </w:rPr>
-        <w:t>Three: in France, nuclear availability explains so much price variance that little remains for weather to explain.</w:t>
+        <w:t>The third: nuclear dominates the French price so much that weather effects are small in comparison.</w:t>
       </w:r>
     </w:p>
     <w:p>
       <w:pPr>
-        <w:spacing w:before="0" w:after="80"/>
-        <w:ind w:left="227"/>
-      </w:pPr>
-      <w:r>
-        <w:rPr>
-          <w:b w:val="0"/>
-          <w:i w:val="0"/>
-          <w:color w:val="212529"/>
-        </w:rPr>
-        <w:t>These three channels make weather redundant — as long as they're intact. In 2022, they were not.</w:t>
-      </w:r>
+        <w:spacing w:before="0" w:after="0"/>
+      </w:pPr>
     </w:p>
     <w:p>
       <w:pPr>
-        <w:spacing w:before="40" w:after="40"/>
-        <w:ind w:left="227"/>
+        <w:spacing w:before="80" w:after="120"/>
+        <w:ind w:left="283"/>
       </w:pPr>
       <w:r>
         <w:rPr>
           <w:b w:val="0"/>
           <w:i/>
-          <w:color w:val="555555"/>
-          <w:sz w:val="20"/>
+          <w:color w:val="666666"/>
+          <w:sz w:val="22"/>
         </w:rPr>
-        <w:t>→  "But this only holds when those three channels are working. In 2022, they all broke at once."</w:t>
+        <w:t>"As long as they hold. In 2022, none of them did."</w:t>
       </w:r>
     </w:p>
     <w:p>
       <w:pPr>
-        <w:spacing w:before="40" w:after="40"/>
+        <w:spacing w:before="120" w:after="120"/>
         <w:pBdr>
-          <w:bottom w:val="single" w:sz="4" w:space="1" w:color="CCCCCC"/>
+          <w:bottom w:val="single" w:sz="4" w:space="4" w:color="CCCCCC"/>
         </w:pBdr>
       </w:pPr>
     </w:p>
     <w:p>
       <w:pPr>
-        <w:spacing w:before="280" w:after="60"/>
+        <w:spacing w:before="320" w:after="80"/>
+        <w:pBdr>
+          <w:bottom w:val="single" w:sz="4" w:space="4" w:color="C8A032"/>
+        </w:pBdr>
       </w:pPr>
       <w:r>
         <w:rPr>
@@ -896,7 +1186,7 @@
         <w:rPr>
           <w:b w:val="0"/>
           <w:i/>
-          <w:color w:val="555555"/>
+          <w:color w:val="666666"/>
           <w:sz w:val="22"/>
         </w:rPr>
         <w:t xml:space="preserve">  · ~1 min 30 s</w:t>
@@ -904,71 +1194,109 @@
     </w:p>
     <w:p>
       <w:pPr>
-        <w:spacing w:before="0" w:after="80"/>
-        <w:ind w:left="227"/>
+        <w:spacing w:before="0" w:after="120"/>
+        <w:ind w:left="283"/>
       </w:pPr>
       <w:r>
         <w:rPr>
           <w:b w:val="0"/>
           <w:i w:val="0"/>
-          <w:color w:val="212529"/>
+          <w:sz w:val="24"/>
         </w:rPr>
-        <w:t>We retrained on 2018–2021 and tested on the full year 2022 — a strict temporal split.</w:t>
+        <w:t>The two cards at the top tell the whole story.</w:t>
       </w:r>
     </w:p>
     <w:p>
       <w:pPr>
-        <w:spacing w:before="0" w:after="80"/>
-        <w:ind w:left="227"/>
+        <w:spacing w:before="0" w:after="0"/>
+      </w:pPr>
+    </w:p>
+    <w:p>
+      <w:pPr>
+        <w:spacing w:before="0" w:after="120"/>
+        <w:ind w:left="283"/>
       </w:pPr>
       <w:r>
         <w:rPr>
           <w:b w:val="0"/>
           <w:i w:val="0"/>
-          <w:color w:val="212529"/>
+          <w:sz w:val="24"/>
         </w:rPr>
-        <w:t>The contrast is stark. Stable period: DM statistic minus 0.565, p = 0.572 — not significant. Crisis 2022: DM statistic minus 13.27, p below 0.001.</w:t>
+        <w:t>Same test. Same models. Different market.</w:t>
       </w:r>
     </w:p>
     <w:p>
       <w:pPr>
-        <w:spacing w:before="0" w:after="80"/>
-        <w:ind w:left="227"/>
+        <w:spacing w:before="0" w:after="0"/>
+      </w:pPr>
+    </w:p>
+    <w:p>
+      <w:pPr>
+        <w:spacing w:before="40" w:after="120"/>
+        <w:ind w:left="283"/>
+      </w:pPr>
+      <w:r>
+        <w:rPr>
+          <w:b/>
+          <w:i w:val="0"/>
+          <w:color w:val="002255"/>
+          <w:sz w:val="24"/>
+        </w:rPr>
+        <w:t>p = 0.572 becomes p &lt; 0.001.   DM = −0.565 becomes DM = −13.27.</w:t>
+      </w:r>
+    </w:p>
+    <w:p>
+      <w:pPr>
+        <w:spacing w:before="0" w:after="0"/>
+      </w:pPr>
+    </w:p>
+    <w:p>
+      <w:pPr>
+        <w:spacing w:before="0" w:after="120"/>
+        <w:ind w:left="283"/>
       </w:pPr>
       <w:r>
         <w:rPr>
           <w:b w:val="0"/>
           <w:i w:val="0"/>
-          <w:color w:val="212529"/>
+          <w:sz w:val="24"/>
         </w:rPr>
-        <w:t>All models degrade sharply: naïve MAE goes from 33 to 73 euros, RF from 17 to 67. But Model C now beats Model B by 0.73 euros per megawatt-hour — statistically huge because it's consistent across nearly 8,760 hours.</w:t>
+        <w:t>In this literature, a DM statistic of minus 3 or 4 is already considered strong. Minus 13 is almost never seen.</w:t>
       </w:r>
     </w:p>
     <w:p>
       <w:pPr>
-        <w:spacing w:before="0" w:after="80"/>
-        <w:ind w:left="227"/>
+        <w:spacing w:before="0" w:after="0"/>
+      </w:pPr>
+    </w:p>
+    <w:p>
+      <w:pPr>
+        <w:spacing w:before="0" w:after="120"/>
+        <w:ind w:left="283"/>
       </w:pPr>
       <w:r>
         <w:rPr>
           <w:b w:val="0"/>
           <w:i w:val="0"/>
-          <w:color w:val="212529"/>
+          <w:sz w:val="24"/>
         </w:rPr>
-        <w:t>XGBoost degrades the most at 76 euros MAE — confirming RF as the more robust architecture under stress.</w:t>
+        <w:t>The chart on the right shows why — 2022 is a completely different distribution. Models degrade badly across the board. But the gap between C and B, which was invisible before, becomes detectable and consistent.</w:t>
       </w:r>
     </w:p>
     <w:p>
       <w:pPr>
-        <w:spacing w:before="40" w:after="40"/>
+        <w:spacing w:before="120" w:after="120"/>
         <w:pBdr>
-          <w:bottom w:val="single" w:sz="4" w:space="1" w:color="CCCCCC"/>
+          <w:bottom w:val="single" w:sz="4" w:space="4" w:color="CCCCCC"/>
         </w:pBdr>
       </w:pPr>
     </w:p>
     <w:p>
       <w:pPr>
-        <w:spacing w:before="280" w:after="60"/>
+        <w:spacing w:before="320" w:after="80"/>
+        <w:pBdr>
+          <w:bottom w:val="single" w:sz="4" w:space="4" w:color="C8A032"/>
+        </w:pBdr>
       </w:pPr>
       <w:r>
         <w:rPr>
@@ -992,7 +1320,7 @@
         <w:rPr>
           <w:b w:val="0"/>
           <w:i/>
-          <w:color w:val="555555"/>
+          <w:color w:val="666666"/>
           <w:sz w:val="22"/>
         </w:rPr>
         <w:t xml:space="preserve">  · ~1 min 30 s</w:t>
@@ -1000,85 +1328,109 @@
     </w:p>
     <w:p>
       <w:pPr>
-        <w:spacing w:before="0" w:after="80"/>
-        <w:ind w:left="227"/>
+        <w:spacing w:before="0" w:after="120"/>
+        <w:ind w:left="283"/>
       </w:pPr>
       <w:r>
         <w:rPr>
           <w:b w:val="0"/>
           <w:i w:val="0"/>
-          <w:color w:val="212529"/>
+          <w:sz w:val="24"/>
         </w:rPr>
-        <w:t>All three redundancy channels break simultaneously in 2022.</w:t>
+        <w:t>Each of the three channels — one by one, they break.</w:t>
       </w:r>
     </w:p>
     <w:p>
       <w:pPr>
-        <w:spacing w:before="0" w:after="80"/>
-        <w:ind w:left="227"/>
+        <w:spacing w:before="0" w:after="0"/>
+      </w:pPr>
+    </w:p>
+    <w:p>
+      <w:pPr>
+        <w:spacing w:before="0" w:after="120"/>
+        <w:ind w:left="283"/>
       </w:pPr>
       <w:r>
         <w:rPr>
           <w:b w:val="0"/>
           <w:i w:val="0"/>
-          <w:color w:val="212529"/>
+          <w:sz w:val="24"/>
         </w:rPr>
-        <w:t>One: TTF decouples from local weather. The Russian gas shock drove prices by geopolitics, not temperature. TTF no longer encodes the weather signal.</w:t>
+        <w:t>TTF first. In 2022, gas prices were driven by the Russian supply shock, not by temperature. The link between weather and gas prices snapped. So TTF stopped encoding the weather signal.</w:t>
       </w:r>
     </w:p>
     <w:p>
       <w:pPr>
-        <w:spacing w:before="0" w:after="80"/>
-        <w:ind w:left="227"/>
+        <w:spacing w:before="0" w:after="0"/>
+      </w:pPr>
+    </w:p>
+    <w:p>
+      <w:pPr>
+        <w:spacing w:before="0" w:after="120"/>
+        <w:ind w:left="283"/>
       </w:pPr>
       <w:r>
         <w:rPr>
           <w:b w:val="0"/>
           <w:i w:val="0"/>
-          <w:color w:val="212529"/>
+          <w:sz w:val="24"/>
         </w:rPr>
-        <w:t>Two: nuclear constraints amplify the temperature effect. With availability at just 40% — around 25 of 63 gigawatts — there was no buffer. Every cold degree fed directly into price.</w:t>
+        <w:t>Nuclear second. 40% availability — half the normal level. In a well-functioning system, nuclear absorbs demand variations. At 40%, every cold day becomes a price event.</w:t>
       </w:r>
     </w:p>
     <w:p>
       <w:pPr>
-        <w:spacing w:before="0" w:after="80"/>
-        <w:ind w:left="227"/>
+        <w:spacing w:before="0" w:after="0"/>
+      </w:pPr>
+    </w:p>
+    <w:p>
+      <w:pPr>
+        <w:spacing w:before="0" w:after="120"/>
+        <w:ind w:left="283"/>
       </w:pPr>
       <w:r>
         <w:rPr>
           <w:b w:val="0"/>
           <w:i w:val="0"/>
-          <w:color w:val="212529"/>
+          <w:sz w:val="24"/>
         </w:rPr>
-        <w:t>Three: signal-to-noise rises. When prices swing by hundreds of euros, the direct temperature effect becomes large enough to measure statistically.</w:t>
+        <w:t>And together, those two effects push price swings into the hundreds of euros — which is when the temperature signal finally becomes statistically measurable.</w:t>
       </w:r>
     </w:p>
     <w:p>
       <w:pPr>
-        <w:spacing w:before="0" w:after="80"/>
-        <w:ind w:left="227"/>
+        <w:spacing w:before="0" w:after="0"/>
+      </w:pPr>
+    </w:p>
+    <w:p>
+      <w:pPr>
+        <w:spacing w:before="40" w:after="120"/>
+        <w:ind w:left="283"/>
       </w:pPr>
       <w:r>
         <w:rPr>
-          <w:b w:val="0"/>
+          <w:b/>
           <w:i w:val="0"/>
-          <w:color w:val="212529"/>
+          <w:color w:val="002255"/>
+          <w:sz w:val="24"/>
         </w:rPr>
-        <w:t>Takeaway: weather's value is not fixed — it's regime-dependent.</w:t>
+        <w:t>Weather isn't universally useful or useless. It depends on what the rest of the market is doing.</w:t>
       </w:r>
     </w:p>
     <w:p>
       <w:pPr>
-        <w:spacing w:before="40" w:after="40"/>
+        <w:spacing w:before="120" w:after="120"/>
         <w:pBdr>
-          <w:bottom w:val="single" w:sz="4" w:space="1" w:color="CCCCCC"/>
+          <w:bottom w:val="single" w:sz="4" w:space="4" w:color="CCCCCC"/>
         </w:pBdr>
       </w:pPr>
     </w:p>
     <w:p>
       <w:pPr>
-        <w:spacing w:before="280" w:after="60"/>
+        <w:spacing w:before="320" w:after="80"/>
+        <w:pBdr>
+          <w:bottom w:val="single" w:sz="4" w:space="4" w:color="C8A032"/>
+        </w:pBdr>
       </w:pPr>
       <w:r>
         <w:rPr>
@@ -1087,7 +1439,7 @@
           <w:color w:val="002255"/>
           <w:sz w:val="26"/>
         </w:rPr>
-        <w:t xml:space="preserve">SLIDE 12 — ECONOMIC VALUE — TRADING BACKTEST   </w:t>
+        <w:t xml:space="preserve">SLIDE 12 — TRADING BACKTEST   </w:t>
       </w:r>
       <w:r>
         <w:rPr>
@@ -1102,7 +1454,7 @@
         <w:rPr>
           <w:b w:val="0"/>
           <w:i/>
-          <w:color w:val="555555"/>
+          <w:color w:val="666666"/>
           <w:sz w:val="22"/>
         </w:rPr>
         <w:t xml:space="preserve">  · ~1 min</w:t>
@@ -1110,57 +1462,109 @@
     </w:p>
     <w:p>
       <w:pPr>
-        <w:spacing w:before="0" w:after="80"/>
-        <w:ind w:left="227"/>
+        <w:spacing w:before="0" w:after="120"/>
+        <w:ind w:left="283"/>
       </w:pPr>
       <w:r>
         <w:rPr>
           <w:b w:val="0"/>
           <w:i w:val="0"/>
-          <w:color w:val="212529"/>
+          <w:sz w:val="24"/>
         </w:rPr>
-        <w:t>Do better forecasts make money? We ran a day-ahead directional strategy at 0.30 euros per megawatt-hour — the central cost scenario.</w:t>
+        <w:t>This slide answers a simple question: do the forecast improvements translate into anything real?</w:t>
       </w:r>
     </w:p>
     <w:p>
       <w:pPr>
-        <w:spacing w:before="0" w:after="80"/>
-        <w:ind w:left="227"/>
+        <w:spacing w:before="0" w:after="0"/>
+      </w:pPr>
+    </w:p>
+    <w:p>
+      <w:pPr>
+        <w:spacing w:before="0" w:after="120"/>
+        <w:ind w:left="283"/>
       </w:pPr>
       <w:r>
         <w:rPr>
           <w:b w:val="0"/>
           <w:i w:val="0"/>
-          <w:color w:val="212529"/>
+          <w:sz w:val="24"/>
         </w:rPr>
-        <w:t>The naïve strategy earns 85,000 euros per megawatt but with a drawdown of 2,367 euros and a Calmar ratio of 37. Both RF models earn around 137,000, with a drawdown five times smaller — 422 euros — and a Calmar of 328.</w:t>
+        <w:t>Focus on the drawdown column.</w:t>
       </w:r>
     </w:p>
     <w:p>
       <w:pPr>
-        <w:spacing w:before="0" w:after="80"/>
-        <w:ind w:left="227"/>
+        <w:spacing w:before="0" w:after="0"/>
+      </w:pPr>
+    </w:p>
+    <w:p>
+      <w:pPr>
+        <w:spacing w:before="40" w:after="120"/>
+        <w:ind w:left="283"/>
+      </w:pPr>
+      <w:r>
+        <w:rPr>
+          <w:b/>
+          <w:i w:val="0"/>
+          <w:color w:val="002255"/>
+          <w:sz w:val="24"/>
+        </w:rPr>
+        <w:t>Naïve: 2,367 euros of drawdown per megawatt.   RF models: 422. Five times smaller.</w:t>
+      </w:r>
+    </w:p>
+    <w:p>
+      <w:pPr>
+        <w:spacing w:before="0" w:after="0"/>
+      </w:pPr>
+    </w:p>
+    <w:p>
+      <w:pPr>
+        <w:spacing w:before="0" w:after="120"/>
+        <w:ind w:left="283"/>
       </w:pPr>
       <w:r>
         <w:rPr>
           <w:b w:val="0"/>
           <w:i w:val="0"/>
-          <w:color w:val="212529"/>
+          <w:sz w:val="24"/>
         </w:rPr>
-        <w:t>XGBoost earns slightly more in gross profit but its drawdown is 1,351 euros, three times RF's. RF posts positive Sharpe ratios every single month. Real skill, not luck.</w:t>
+        <w:t>That's the number that matters in practice. It's not about making more money in absolute terms — it's about how much you lose when you're wrong.</w:t>
       </w:r>
     </w:p>
     <w:p>
       <w:pPr>
-        <w:spacing w:before="40" w:after="40"/>
-        <w:pBdr>
-          <w:bottom w:val="single" w:sz="4" w:space="1" w:color="CCCCCC"/>
-        </w:pBdr>
+        <w:spacing w:before="0" w:after="0"/>
       </w:pPr>
     </w:p>
     <w:p>
       <w:pPr>
-        <w:spacing w:before="280" w:after="60"/>
+        <w:spacing w:before="0" w:after="120"/>
+        <w:ind w:left="283"/>
+      </w:pPr>
+      <w:r>
+        <w:rPr>
+          <w:b w:val="0"/>
+          <w:i w:val="0"/>
+          <w:sz w:val="24"/>
+        </w:rPr>
+        <w:t>And the strategy earns positive Sharpe ratios every single month of the test period. No lucky quarter hiding a bad year. Consistent.</w:t>
+      </w:r>
+    </w:p>
+    <w:p>
+      <w:pPr>
+        <w:spacing w:before="120" w:after="120"/>
+        <w:pBdr>
+          <w:bottom w:val="single" w:sz="4" w:space="4" w:color="CCCCCC"/>
+        </w:pBdr>
+      </w:pPr>
+    </w:p>
+    <w:p>
+      <w:pPr>
+        <w:spacing w:before="320" w:after="80"/>
+        <w:pBdr>
+          <w:bottom w:val="single" w:sz="4" w:space="4" w:color="C8A032"/>
+        </w:pBdr>
       </w:pPr>
       <w:r>
         <w:rPr>
@@ -1184,7 +1588,7 @@
         <w:rPr>
           <w:b w:val="0"/>
           <w:i/>
-          <w:color w:val="555555"/>
+          <w:color w:val="666666"/>
           <w:sz w:val="22"/>
         </w:rPr>
         <w:t xml:space="preserve">  · ~30 s</w:t>
@@ -1192,29 +1596,70 @@
     </w:p>
     <w:p>
       <w:pPr>
-        <w:spacing w:before="0" w:after="80"/>
-        <w:ind w:left="227"/>
+        <w:spacing w:before="0" w:after="120"/>
+        <w:ind w:left="283"/>
       </w:pPr>
       <w:r>
         <w:rPr>
           <w:b w:val="0"/>
           <w:i w:val="0"/>
-          <w:color w:val="212529"/>
+          <w:sz w:val="24"/>
         </w:rPr>
-        <w:t>Quick robustness check. RF's Sharpe ratio across the three cost scenarios moves from 19.51 to 19.16 — under two percent degradation. Positive Sharpe every month. The DM non-significance result holds across multiple sub-periods. The conclusions don't depend on our specific cost assumptions.</w:t>
+        <w:t>One concern: do these results depend on the cost assumption we chose?</w:t>
       </w:r>
     </w:p>
     <w:p>
       <w:pPr>
-        <w:spacing w:before="40" w:after="40"/>
-        <w:pBdr>
-          <w:bottom w:val="single" w:sz="4" w:space="1" w:color="CCCCCC"/>
-        </w:pBdr>
+        <w:spacing w:before="0" w:after="0"/>
       </w:pPr>
     </w:p>
     <w:p>
       <w:pPr>
-        <w:spacing w:before="280" w:after="60"/>
+        <w:spacing w:before="0" w:after="120"/>
+        <w:ind w:left="283"/>
+      </w:pPr>
+      <w:r>
+        <w:rPr>
+          <w:b w:val="0"/>
+          <w:i w:val="0"/>
+          <w:sz w:val="24"/>
+        </w:rPr>
+        <w:t>The table shows three scenarios. The Sharpe barely moves — under two percent degradation from cheapest to most expensive.</w:t>
+      </w:r>
+    </w:p>
+    <w:p>
+      <w:pPr>
+        <w:spacing w:before="0" w:after="0"/>
+      </w:pPr>
+    </w:p>
+    <w:p>
+      <w:pPr>
+        <w:spacing w:before="0" w:after="120"/>
+        <w:ind w:left="283"/>
+      </w:pPr>
+      <w:r>
+        <w:rPr>
+          <w:b w:val="0"/>
+          <w:i w:val="0"/>
+          <w:sz w:val="24"/>
+        </w:rPr>
+        <w:t>The conclusion is stable. It's not an artefact of our parameters.</w:t>
+      </w:r>
+    </w:p>
+    <w:p>
+      <w:pPr>
+        <w:spacing w:before="120" w:after="120"/>
+        <w:pBdr>
+          <w:bottom w:val="single" w:sz="4" w:space="4" w:color="CCCCCC"/>
+        </w:pBdr>
+      </w:pPr>
+    </w:p>
+    <w:p>
+      <w:pPr>
+        <w:spacing w:before="320" w:after="80"/>
+        <w:pBdr>
+          <w:bottom w:val="single" w:sz="4" w:space="4" w:color="C8A032"/>
+        </w:pBdr>
       </w:pPr>
       <w:r>
         <w:rPr>
@@ -1223,7 +1668,7 @@
           <w:color w:val="002255"/>
           <w:sz w:val="26"/>
         </w:rPr>
-        <w:t xml:space="preserve">SLIDE 14 — LIMITATIONS &amp; FUTURE WORK   </w:t>
+        <w:t xml:space="preserve">SLIDE 14 — LIMITATIONS   </w:t>
       </w:r>
       <w:r>
         <w:rPr>
@@ -1238,7 +1683,7 @@
         <w:rPr>
           <w:b w:val="0"/>
           <w:i/>
-          <w:color w:val="555555"/>
+          <w:color w:val="666666"/>
           <w:sz w:val="22"/>
         </w:rPr>
         <w:t xml:space="preserve">  · ~45 s</w:t>
@@ -1246,57 +1691,70 @@
     </w:p>
     <w:p>
       <w:pPr>
-        <w:spacing w:before="0" w:after="80"/>
-        <w:ind w:left="227"/>
+        <w:spacing w:before="0" w:after="120"/>
+        <w:ind w:left="283"/>
       </w:pPr>
       <w:r>
         <w:rPr>
           <w:b w:val="0"/>
           <w:i w:val="0"/>
-          <w:color w:val="212529"/>
+          <w:sz w:val="24"/>
         </w:rPr>
-        <w:t>Six honest limitations.</w:t>
+        <w:t>The most important one is the ERA5 point.</w:t>
       </w:r>
     </w:p>
     <w:p>
       <w:pPr>
-        <w:spacing w:before="0" w:after="80"/>
-        <w:ind w:left="227"/>
+        <w:spacing w:before="0" w:after="0"/>
+      </w:pPr>
+    </w:p>
+    <w:p>
+      <w:pPr>
+        <w:spacing w:before="0" w:after="120"/>
+        <w:ind w:left="283"/>
       </w:pPr>
       <w:r>
         <w:rPr>
           <w:b w:val="0"/>
           <w:i w:val="0"/>
-          <w:color w:val="212529"/>
+          <w:sz w:val="24"/>
         </w:rPr>
-        <w:t>ERA5 is perfect hindsight weather — in production you'd use forecasts with 10–30% error, so our result is an upper bound. We didn't do walk-forward retraining. Carbon prices were excluded. XGBoost wasn't tuned — Bayesian optimisation could close the gap. We only cover France; other markets may differ. And transaction costs are flat — large books would face liquidity constraints.</w:t>
+        <w:t>ERA5 gives us the actual weather that happened. In production, you'd only have a forecast — with real errors. So our result is a ceiling on how much weather can help. Even the perfect version barely matters in a stable market. That actually strengthens the conclusion rather than weakening it.</w:t>
       </w:r>
     </w:p>
     <w:p>
       <w:pPr>
-        <w:spacing w:before="0" w:after="80"/>
-        <w:ind w:left="227"/>
+        <w:spacing w:before="0" w:after="0"/>
+      </w:pPr>
+    </w:p>
+    <w:p>
+      <w:pPr>
+        <w:spacing w:before="0" w:after="120"/>
+        <w:ind w:left="283"/>
       </w:pPr>
       <w:r>
         <w:rPr>
           <w:b w:val="0"/>
           <w:i w:val="0"/>
-          <w:color w:val="212529"/>
+          <w:sz w:val="24"/>
         </w:rPr>
-        <w:t>These define the perimeter of what we can claim.</w:t>
+        <w:t>The other five — no walk-forward retraining, no carbon prices, XGBoost not tuned, one country, flat cost model — are genuine. We document them because they define the scope of what we can claim.</w:t>
       </w:r>
     </w:p>
     <w:p>
       <w:pPr>
-        <w:spacing w:before="40" w:after="40"/>
+        <w:spacing w:before="120" w:after="120"/>
         <w:pBdr>
-          <w:bottom w:val="single" w:sz="4" w:space="1" w:color="CCCCCC"/>
+          <w:bottom w:val="single" w:sz="4" w:space="4" w:color="CCCCCC"/>
         </w:pBdr>
       </w:pPr>
     </w:p>
     <w:p>
       <w:pPr>
-        <w:spacing w:before="280" w:after="60"/>
+        <w:spacing w:before="320" w:after="80"/>
+        <w:pBdr>
+          <w:bottom w:val="single" w:sz="4" w:space="4" w:color="C8A032"/>
+        </w:pBdr>
       </w:pPr>
       <w:r>
         <w:rPr>
@@ -1320,7 +1778,7 @@
         <w:rPr>
           <w:b w:val="0"/>
           <w:i/>
-          <w:color w:val="555555"/>
+          <w:color w:val="666666"/>
           <w:sz w:val="22"/>
         </w:rPr>
         <w:t xml:space="preserve">  · ~1 min 30 s</w:t>
@@ -1328,99 +1786,147 @@
     </w:p>
     <w:p>
       <w:pPr>
-        <w:spacing w:before="0" w:after="80"/>
-        <w:ind w:left="227"/>
+        <w:spacing w:before="0" w:after="120"/>
+        <w:ind w:left="283"/>
       </w:pPr>
       <w:r>
         <w:rPr>
           <w:b w:val="0"/>
           <w:i w:val="0"/>
-          <w:color w:val="212529"/>
+          <w:sz w:val="24"/>
         </w:rPr>
-        <w:t>Four takeaways.</w:t>
+        <w:t>Four things to take away.</w:t>
       </w:r>
     </w:p>
     <w:p>
       <w:pPr>
-        <w:spacing w:before="0" w:after="80"/>
-        <w:ind w:left="227"/>
+        <w:spacing w:before="0" w:after="0"/>
+      </w:pPr>
+    </w:p>
+    <w:p>
+      <w:pPr>
+        <w:spacing w:before="0" w:after="120"/>
+        <w:ind w:left="283"/>
       </w:pPr>
       <w:r>
         <w:rPr>
           <w:b w:val="0"/>
           <w:i w:val="0"/>
-          <w:color w:val="212529"/>
+          <w:sz w:val="24"/>
         </w:rPr>
-        <w:t>One: machine learning decisively beats the naïve benchmark — minus 49% MAE, R-squared 0.78, confirmed across all twelve months.</w:t>
+        <w:t>ML works — clearly and robustly. That's not the surprise.</w:t>
       </w:r>
     </w:p>
     <w:p>
       <w:pPr>
-        <w:spacing w:before="0" w:after="80"/>
-        <w:ind w:left="227"/>
+        <w:spacing w:before="0" w:after="0"/>
+      </w:pPr>
+    </w:p>
+    <w:p>
+      <w:pPr>
+        <w:spacing w:before="0" w:after="120"/>
+        <w:ind w:left="283"/>
       </w:pPr>
       <w:r>
         <w:rPr>
           <w:b w:val="0"/>
           <w:i w:val="0"/>
-          <w:color w:val="212529"/>
+          <w:sz w:val="24"/>
         </w:rPr>
-        <w:t>Two: the value of weather is regime-dependent. Non-significant in stable conditions, highly significant in the 2022 crisis. That's our core contribution.</w:t>
+        <w:t>The surprise is the second point. Weather matters — but only when the channels that normally encode it break down. In stable conditions, it's redundant. In a crisis, it's essential. That's a regime-dependent finding, and it's the core contribution.</w:t>
       </w:r>
     </w:p>
     <w:p>
       <w:pPr>
-        <w:spacing w:before="0" w:after="80"/>
-        <w:ind w:left="227"/>
+        <w:spacing w:before="0" w:after="0"/>
+      </w:pPr>
+    </w:p>
+    <w:p>
+      <w:pPr>
+        <w:spacing w:before="0" w:after="120"/>
+        <w:ind w:left="283"/>
       </w:pPr>
       <w:r>
         <w:rPr>
           <w:b w:val="0"/>
           <w:i w:val="0"/>
-          <w:color w:val="212529"/>
+          <w:sz w:val="24"/>
         </w:rPr>
-        <w:t>Three: Random Forest outperforms XGBoost on risk-adjusted metrics — Calmar 328 versus 107 — and holds up better under stress.</w:t>
+        <w:t>Random Forest holds up better than XGBoost under stress — a direct implication for model selection in volatile markets.</w:t>
       </w:r>
     </w:p>
     <w:p>
       <w:pPr>
-        <w:spacing w:before="0" w:after="80"/>
-        <w:ind w:left="227"/>
+        <w:spacing w:before="0" w:after="0"/>
+      </w:pPr>
+    </w:p>
+    <w:p>
+      <w:pPr>
+        <w:spacing w:before="0" w:after="120"/>
+        <w:ind w:left="283"/>
       </w:pPr>
       <w:r>
         <w:rPr>
           <w:b w:val="0"/>
           <w:i w:val="0"/>
-          <w:color w:val="212529"/>
+          <w:sz w:val="24"/>
         </w:rPr>
-        <w:t>Four: the forecasts create real economic value — 137,000 euros per megawatt per year, drawdown five times smaller than the benchmark.</w:t>
+        <w:t>And forecasts create real economic value — not just better numbers on a metric.</w:t>
       </w:r>
     </w:p>
     <w:p>
       <w:pPr>
-        <w:spacing w:before="0" w:after="80"/>
-        <w:ind w:left="227"/>
+        <w:spacing w:before="0" w:after="0"/>
+      </w:pPr>
+    </w:p>
+    <w:p>
+      <w:pPr>
+        <w:spacing w:before="40" w:after="120"/>
+        <w:ind w:left="283"/>
+      </w:pPr>
+      <w:r>
+        <w:rPr>
+          <w:b/>
+          <w:i w:val="0"/>
+          <w:color w:val="002255"/>
+          <w:sz w:val="24"/>
+        </w:rPr>
+        <w:t>The practical takeaway: build a system that knows which regime it's in.</w:t>
+      </w:r>
+    </w:p>
+    <w:p>
+      <w:pPr>
+        <w:spacing w:before="0" w:after="0"/>
+      </w:pPr>
+    </w:p>
+    <w:p>
+      <w:pPr>
+        <w:spacing w:before="0" w:after="120"/>
+        <w:ind w:left="283"/>
       </w:pPr>
       <w:r>
         <w:rPr>
           <w:b w:val="0"/>
           <w:i w:val="0"/>
-          <w:color w:val="212529"/>
+          <w:sz w:val="24"/>
         </w:rPr>
-        <w:t>The practical implication: don't always include or always exclude weather. Build a regime detector. Thank you very much.</w:t>
+        <w:t>Thank you.</w:t>
       </w:r>
     </w:p>
     <w:p>
       <w:pPr>
-        <w:spacing w:before="40" w:after="40"/>
+        <w:spacing w:before="120" w:after="120"/>
         <w:pBdr>
-          <w:bottom w:val="single" w:sz="4" w:space="1" w:color="CCCCCC"/>
+          <w:bottom w:val="single" w:sz="4" w:space="4" w:color="CCCCCC"/>
         </w:pBdr>
       </w:pPr>
     </w:p>
     <w:p>
       <w:pPr>
-        <w:spacing w:before="280" w:after="60"/>
+        <w:spacing w:before="320" w:after="80"/>
+        <w:pBdr>
+          <w:bottom w:val="single" w:sz="4" w:space="4" w:color="C8A032"/>
+        </w:pBdr>
       </w:pPr>
       <w:r>
         <w:rPr>
@@ -1444,7 +1950,7 @@
         <w:rPr>
           <w:b w:val="0"/>
           <w:i/>
-          <w:color w:val="555555"/>
+          <w:color w:val="666666"/>
           <w:sz w:val="22"/>
         </w:rPr>
         <w:t xml:space="preserve">  · ~20 s</w:t>
@@ -1452,46 +1958,48 @@
     </w:p>
     <w:p>
       <w:pPr>
-        <w:spacing w:before="0" w:after="80"/>
-        <w:ind w:left="227"/>
+        <w:spacing w:before="80" w:after="120"/>
+        <w:ind w:left="283"/>
       </w:pPr>
       <w:r>
         <w:rPr>
           <w:b w:val="0"/>
           <w:i/>
-          <w:color w:val="555555"/>
+          <w:color w:val="666666"/>
+          <w:sz w:val="22"/>
         </w:rPr>
-        <w:t>[Smile. Pause 2–3 seconds. Let the examiner speak first.]</w:t>
+        <w:t>[Smile. Wait. Let them speak first.]</w:t>
       </w:r>
     </w:p>
     <w:p>
       <w:pPr>
-        <w:spacing w:before="0" w:after="80"/>
-        <w:ind w:left="227"/>
+        <w:spacing w:before="80" w:after="120"/>
+        <w:ind w:left="283"/>
       </w:pPr>
       <w:r>
         <w:rPr>
           <w:b w:val="0"/>
           <w:i/>
-          <w:color w:val="555555"/>
+          <w:color w:val="666666"/>
+          <w:sz w:val="22"/>
         </w:rPr>
-        <w:t>[If silence: "Would you like us to start with any particular aspect of the methodology?"]</w:t>
+        <w:t>[If silence: "Would you like to start with any particular aspect?"]</w:t>
       </w:r>
     </w:p>
     <w:p>
       <w:pPr>
-        <w:spacing w:before="40" w:after="40"/>
+        <w:spacing w:before="120" w:after="120"/>
         <w:pBdr>
-          <w:bottom w:val="single" w:sz="4" w:space="1" w:color="CCCCCC"/>
+          <w:bottom w:val="single" w:sz="4" w:space="4" w:color="CCCCCC"/>
         </w:pBdr>
       </w:pPr>
     </w:p>
     <w:p/>
     <w:p>
       <w:pPr>
-        <w:spacing w:before="80" w:after="40"/>
+        <w:spacing w:before="160" w:after="40"/>
         <w:pBdr>
-          <w:bottom w:val="single" w:sz="12" w:space="4" w:color="002255"/>
+          <w:bottom w:val="single" w:sz="10" w:space="4" w:color="002255"/>
         </w:pBdr>
       </w:pPr>
       <w:r>
@@ -1499,7 +2007,7 @@
           <w:b/>
           <w:i w:val="0"/>
           <w:color w:val="002255"/>
-          <w:sz w:val="40"/>
+          <w:sz w:val="34"/>
         </w:rPr>
         <w:t>TIMING REFERENCE</w:t>
       </w:r>
@@ -1518,7 +2026,7 @@
       <w:tr>
         <w:tc>
           <w:tcPr>
-            <w:tcW w:type="dxa" w:w="4535"/>
+            <w:tcW w:type="dxa" w:w="4252"/>
             <w:shd w:val="clear" w:color="auto" w:fill="002255"/>
           </w:tcPr>
           <w:p>
@@ -1526,7 +2034,7 @@
               <w:rPr>
                 <w:b/>
                 <w:color w:val="FFFFFF"/>
-                <w:sz w:val="20"/>
+                <w:sz w:val="22"/>
               </w:rPr>
               <w:t>Slide</w:t>
             </w:r>
@@ -1542,7 +2050,7 @@
               <w:rPr>
                 <w:b/>
                 <w:color w:val="FFFFFF"/>
-                <w:sz w:val="20"/>
+                <w:sz w:val="22"/>
               </w:rPr>
               <w:t>Speaker</w:t>
             </w:r>
@@ -1550,7 +2058,7 @@
         </w:tc>
         <w:tc>
           <w:tcPr>
-            <w:tcW w:type="dxa" w:w="1701"/>
+            <w:tcW w:type="dxa" w:w="1814"/>
             <w:shd w:val="clear" w:color="auto" w:fill="002255"/>
           </w:tcPr>
           <w:p>
@@ -1558,7 +2066,7 @@
               <w:rPr>
                 <w:b/>
                 <w:color w:val="FFFFFF"/>
-                <w:sz w:val="20"/>
+                <w:sz w:val="22"/>
               </w:rPr>
               <w:t>Target</w:t>
             </w:r>
@@ -1568,13 +2076,14 @@
       <w:tr>
         <w:tc>
           <w:tcPr>
-            <w:tcW w:type="dxa" w:w="4535"/>
+            <w:tcW w:type="dxa" w:w="4252"/>
             <w:shd w:val="clear" w:color="auto" w:fill="EEF3F9"/>
           </w:tcPr>
           <w:p>
             <w:r>
               <w:rPr>
-                <w:sz w:val="20"/>
+                <w:b w:val="0"/>
+                <w:sz w:val="22"/>
               </w:rPr>
               <w:t>1 — Title</w:t>
             </w:r>
@@ -1588,7 +2097,8 @@
           <w:p>
             <w:r>
               <w:rPr>
-                <w:sz w:val="20"/>
+                <w:b w:val="0"/>
+                <w:sz w:val="22"/>
               </w:rPr>
               <w:t>LEO</w:t>
             </w:r>
@@ -1596,13 +2106,14 @@
         </w:tc>
         <w:tc>
           <w:tcPr>
-            <w:tcW w:type="dxa" w:w="1701"/>
+            <w:tcW w:type="dxa" w:w="1814"/>
             <w:shd w:val="clear" w:color="auto" w:fill="EEF3F9"/>
           </w:tcPr>
           <w:p>
             <w:r>
               <w:rPr>
-                <w:sz w:val="20"/>
+                <w:b w:val="0"/>
+                <w:sz w:val="22"/>
               </w:rPr>
               <w:t>20 s</w:t>
             </w:r>
@@ -1612,15 +2123,16 @@
       <w:tr>
         <w:tc>
           <w:tcPr>
-            <w:tcW w:type="dxa" w:w="4535"/>
+            <w:tcW w:type="dxa" w:w="4252"/>
             <w:shd w:val="clear" w:color="auto" w:fill="FFFFFF"/>
           </w:tcPr>
           <w:p>
             <w:r>
               <w:rPr>
-                <w:sz w:val="20"/>
+                <w:b w:val="0"/>
+                <w:sz w:val="22"/>
               </w:rPr>
-              <w:t>2 — Context &amp; Motivation</w:t>
+              <w:t>2 — Context</w:t>
             </w:r>
           </w:p>
         </w:tc>
@@ -1632,7 +2144,8 @@
           <w:p>
             <w:r>
               <w:rPr>
-                <w:sz w:val="20"/>
+                <w:b w:val="0"/>
+                <w:sz w:val="22"/>
               </w:rPr>
               <w:t>LEO</w:t>
             </w:r>
@@ -1640,13 +2153,14 @@
         </w:tc>
         <w:tc>
           <w:tcPr>
-            <w:tcW w:type="dxa" w:w="1701"/>
+            <w:tcW w:type="dxa" w:w="1814"/>
             <w:shd w:val="clear" w:color="auto" w:fill="FFFFFF"/>
           </w:tcPr>
           <w:p>
             <w:r>
               <w:rPr>
-                <w:sz w:val="20"/>
+                <w:b w:val="0"/>
+                <w:sz w:val="22"/>
               </w:rPr>
               <w:t>1 min 30 s</w:t>
             </w:r>
@@ -1656,15 +2170,16 @@
       <w:tr>
         <w:tc>
           <w:tcPr>
-            <w:tcW w:type="dxa" w:w="4535"/>
+            <w:tcW w:type="dxa" w:w="4252"/>
             <w:shd w:val="clear" w:color="auto" w:fill="EEF3F9"/>
           </w:tcPr>
           <w:p>
             <w:r>
               <w:rPr>
-                <w:sz w:val="20"/>
+                <w:b w:val="0"/>
+                <w:sz w:val="22"/>
               </w:rPr>
-              <w:t>3 — Research Question</w:t>
+              <w:t>3 — Research Q</w:t>
             </w:r>
           </w:p>
         </w:tc>
@@ -1676,7 +2191,8 @@
           <w:p>
             <w:r>
               <w:rPr>
-                <w:sz w:val="20"/>
+                <w:b w:val="0"/>
+                <w:sz w:val="22"/>
               </w:rPr>
               <w:t>LEO</w:t>
             </w:r>
@@ -1684,13 +2200,14 @@
         </w:tc>
         <w:tc>
           <w:tcPr>
-            <w:tcW w:type="dxa" w:w="1701"/>
+            <w:tcW w:type="dxa" w:w="1814"/>
             <w:shd w:val="clear" w:color="auto" w:fill="EEF3F9"/>
           </w:tcPr>
           <w:p>
             <w:r>
               <w:rPr>
-                <w:sz w:val="20"/>
+                <w:b w:val="0"/>
+                <w:sz w:val="22"/>
               </w:rPr>
               <w:t>1 min</w:t>
             </w:r>
@@ -1700,13 +2217,14 @@
       <w:tr>
         <w:tc>
           <w:tcPr>
-            <w:tcW w:type="dxa" w:w="4535"/>
+            <w:tcW w:type="dxa" w:w="4252"/>
             <w:shd w:val="clear" w:color="auto" w:fill="FFFFFF"/>
           </w:tcPr>
           <w:p>
             <w:r>
               <w:rPr>
-                <w:sz w:val="20"/>
+                <w:b w:val="0"/>
+                <w:sz w:val="22"/>
               </w:rPr>
               <w:t>4 — Data</w:t>
             </w:r>
@@ -1720,7 +2238,8 @@
           <w:p>
             <w:r>
               <w:rPr>
-                <w:sz w:val="20"/>
+                <w:b w:val="0"/>
+                <w:sz w:val="22"/>
               </w:rPr>
               <w:t>LEO</w:t>
             </w:r>
@@ -1728,13 +2247,14 @@
         </w:tc>
         <w:tc>
           <w:tcPr>
-            <w:tcW w:type="dxa" w:w="1701"/>
+            <w:tcW w:type="dxa" w:w="1814"/>
             <w:shd w:val="clear" w:color="auto" w:fill="FFFFFF"/>
           </w:tcPr>
           <w:p>
             <w:r>
               <w:rPr>
-                <w:sz w:val="20"/>
+                <w:b w:val="0"/>
+                <w:sz w:val="22"/>
               </w:rPr>
               <w:t>1 min</w:t>
             </w:r>
@@ -1744,13 +2264,14 @@
       <w:tr>
         <w:tc>
           <w:tcPr>
-            <w:tcW w:type="dxa" w:w="4535"/>
+            <w:tcW w:type="dxa" w:w="4252"/>
             <w:shd w:val="clear" w:color="auto" w:fill="EEF3F9"/>
           </w:tcPr>
           <w:p>
             <w:r>
               <w:rPr>
-                <w:sz w:val="20"/>
+                <w:b w:val="0"/>
+                <w:sz w:val="22"/>
               </w:rPr>
               <w:t>5 — Methodology</w:t>
             </w:r>
@@ -1764,7 +2285,8 @@
           <w:p>
             <w:r>
               <w:rPr>
-                <w:sz w:val="20"/>
+                <w:b w:val="0"/>
+                <w:sz w:val="22"/>
               </w:rPr>
               <w:t>LEO</w:t>
             </w:r>
@@ -1772,13 +2294,14 @@
         </w:tc>
         <w:tc>
           <w:tcPr>
-            <w:tcW w:type="dxa" w:w="1701"/>
+            <w:tcW w:type="dxa" w:w="1814"/>
             <w:shd w:val="clear" w:color="auto" w:fill="EEF3F9"/>
           </w:tcPr>
           <w:p>
             <w:r>
               <w:rPr>
-                <w:sz w:val="20"/>
+                <w:b w:val="0"/>
+                <w:sz w:val="22"/>
               </w:rPr>
               <w:t>1 min</w:t>
             </w:r>
@@ -1788,13 +2311,14 @@
       <w:tr>
         <w:tc>
           <w:tcPr>
-            <w:tcW w:type="dxa" w:w="4535"/>
+            <w:tcW w:type="dxa" w:w="4252"/>
             <w:shd w:val="clear" w:color="auto" w:fill="FFFFFF"/>
           </w:tcPr>
           <w:p>
             <w:r>
               <w:rPr>
-                <w:sz w:val="20"/>
+                <w:b w:val="0"/>
+                <w:sz w:val="22"/>
               </w:rPr>
               <w:t>6 — Results stable</w:t>
             </w:r>
@@ -1808,7 +2332,8 @@
           <w:p>
             <w:r>
               <w:rPr>
-                <w:sz w:val="20"/>
+                <w:b w:val="0"/>
+                <w:sz w:val="22"/>
               </w:rPr>
               <w:t>LEO</w:t>
             </w:r>
@@ -1816,13 +2341,14 @@
         </w:tc>
         <w:tc>
           <w:tcPr>
-            <w:tcW w:type="dxa" w:w="1701"/>
+            <w:tcW w:type="dxa" w:w="1814"/>
             <w:shd w:val="clear" w:color="auto" w:fill="FFFFFF"/>
           </w:tcPr>
           <w:p>
             <w:r>
               <w:rPr>
-                <w:sz w:val="20"/>
+                <w:b w:val="0"/>
+                <w:sz w:val="22"/>
               </w:rPr>
               <w:t>1 min 30 s</w:t>
             </w:r>
@@ -1832,13 +2358,14 @@
       <w:tr>
         <w:tc>
           <w:tcPr>
-            <w:tcW w:type="dxa" w:w="4535"/>
+            <w:tcW w:type="dxa" w:w="4252"/>
             <w:shd w:val="clear" w:color="auto" w:fill="EEF3F9"/>
           </w:tcPr>
           <w:p>
             <w:r>
               <w:rPr>
-                <w:sz w:val="20"/>
+                <w:b w:val="0"/>
+                <w:sz w:val="22"/>
               </w:rPr>
               <w:t>7 — Central Finding</w:t>
             </w:r>
@@ -1852,7 +2379,8 @@
           <w:p>
             <w:r>
               <w:rPr>
-                <w:sz w:val="20"/>
+                <w:b w:val="0"/>
+                <w:sz w:val="22"/>
               </w:rPr>
               <w:t>LEO</w:t>
             </w:r>
@@ -1860,13 +2388,14 @@
         </w:tc>
         <w:tc>
           <w:tcPr>
-            <w:tcW w:type="dxa" w:w="1701"/>
+            <w:tcW w:type="dxa" w:w="1814"/>
             <w:shd w:val="clear" w:color="auto" w:fill="EEF3F9"/>
           </w:tcPr>
           <w:p>
             <w:r>
               <w:rPr>
-                <w:sz w:val="20"/>
+                <w:b w:val="0"/>
+                <w:sz w:val="22"/>
               </w:rPr>
               <w:t>1 min</w:t>
             </w:r>
@@ -1876,15 +2405,16 @@
       <w:tr>
         <w:tc>
           <w:tcPr>
-            <w:tcW w:type="dxa" w:w="4535"/>
+            <w:tcW w:type="dxa" w:w="4252"/>
             <w:shd w:val="clear" w:color="auto" w:fill="FFFFFF"/>
           </w:tcPr>
           <w:p>
             <w:r>
               <w:rPr>
-                <w:sz w:val="20"/>
+                <w:b w:val="0"/>
+                <w:sz w:val="22"/>
               </w:rPr>
-              <w:t>8 — Feature Importance</w:t>
+              <w:t>8 — Feature Imp.</w:t>
             </w:r>
           </w:p>
         </w:tc>
@@ -1896,7 +2426,8 @@
           <w:p>
             <w:r>
               <w:rPr>
-                <w:sz w:val="20"/>
+                <w:b w:val="0"/>
+                <w:sz w:val="22"/>
               </w:rPr>
               <w:t>LYAM</w:t>
             </w:r>
@@ -1904,13 +2435,14 @@
         </w:tc>
         <w:tc>
           <w:tcPr>
-            <w:tcW w:type="dxa" w:w="1701"/>
+            <w:tcW w:type="dxa" w:w="1814"/>
             <w:shd w:val="clear" w:color="auto" w:fill="FFFFFF"/>
           </w:tcPr>
           <w:p>
             <w:r>
               <w:rPr>
-                <w:sz w:val="20"/>
+                <w:b w:val="0"/>
+                <w:sz w:val="22"/>
               </w:rPr>
               <w:t>1 min</w:t>
             </w:r>
@@ -1920,13 +2452,14 @@
       <w:tr>
         <w:tc>
           <w:tcPr>
-            <w:tcW w:type="dxa" w:w="4535"/>
+            <w:tcW w:type="dxa" w:w="4252"/>
             <w:shd w:val="clear" w:color="auto" w:fill="EEF3F9"/>
           </w:tcPr>
           <w:p>
             <w:r>
               <w:rPr>
-                <w:sz w:val="20"/>
+                <w:b w:val="0"/>
+                <w:sz w:val="22"/>
               </w:rPr>
               <w:t>9 — Redundancy</w:t>
             </w:r>
@@ -1940,7 +2473,8 @@
           <w:p>
             <w:r>
               <w:rPr>
-                <w:sz w:val="20"/>
+                <w:b w:val="0"/>
+                <w:sz w:val="22"/>
               </w:rPr>
               <w:t>LYAM</w:t>
             </w:r>
@@ -1948,13 +2482,14 @@
         </w:tc>
         <w:tc>
           <w:tcPr>
-            <w:tcW w:type="dxa" w:w="1701"/>
+            <w:tcW w:type="dxa" w:w="1814"/>
             <w:shd w:val="clear" w:color="auto" w:fill="EEF3F9"/>
           </w:tcPr>
           <w:p>
             <w:r>
               <w:rPr>
-                <w:sz w:val="20"/>
+                <w:b w:val="0"/>
+                <w:sz w:val="22"/>
               </w:rPr>
               <w:t>1 min 30 s</w:t>
             </w:r>
@@ -1964,13 +2499,14 @@
       <w:tr>
         <w:tc>
           <w:tcPr>
-            <w:tcW w:type="dxa" w:w="4535"/>
+            <w:tcW w:type="dxa" w:w="4252"/>
             <w:shd w:val="clear" w:color="auto" w:fill="FFFFFF"/>
           </w:tcPr>
           <w:p>
             <w:r>
               <w:rPr>
-                <w:sz w:val="20"/>
+                <w:b w:val="0"/>
+                <w:sz w:val="22"/>
               </w:rPr>
               <w:t>10 — 2022 Crisis</w:t>
             </w:r>
@@ -1984,7 +2520,8 @@
           <w:p>
             <w:r>
               <w:rPr>
-                <w:sz w:val="20"/>
+                <w:b w:val="0"/>
+                <w:sz w:val="22"/>
               </w:rPr>
               <w:t>LYAM</w:t>
             </w:r>
@@ -1992,13 +2529,14 @@
         </w:tc>
         <w:tc>
           <w:tcPr>
-            <w:tcW w:type="dxa" w:w="1701"/>
+            <w:tcW w:type="dxa" w:w="1814"/>
             <w:shd w:val="clear" w:color="auto" w:fill="FFFFFF"/>
           </w:tcPr>
           <w:p>
             <w:r>
               <w:rPr>
-                <w:sz w:val="20"/>
+                <w:b w:val="0"/>
+                <w:sz w:val="22"/>
               </w:rPr>
               <w:t>1 min 30 s</w:t>
             </w:r>
@@ -2008,13 +2546,14 @@
       <w:tr>
         <w:tc>
           <w:tcPr>
-            <w:tcW w:type="dxa" w:w="4535"/>
+            <w:tcW w:type="dxa" w:w="4252"/>
             <w:shd w:val="clear" w:color="auto" w:fill="EEF3F9"/>
           </w:tcPr>
           <w:p>
             <w:r>
               <w:rPr>
-                <w:sz w:val="20"/>
+                <w:b w:val="0"/>
+                <w:sz w:val="22"/>
               </w:rPr>
               <w:t>11 — Why 2022</w:t>
             </w:r>
@@ -2028,7 +2567,8 @@
           <w:p>
             <w:r>
               <w:rPr>
-                <w:sz w:val="20"/>
+                <w:b w:val="0"/>
+                <w:sz w:val="22"/>
               </w:rPr>
               <w:t>LYAM</w:t>
             </w:r>
@@ -2036,13 +2576,14 @@
         </w:tc>
         <w:tc>
           <w:tcPr>
-            <w:tcW w:type="dxa" w:w="1701"/>
+            <w:tcW w:type="dxa" w:w="1814"/>
             <w:shd w:val="clear" w:color="auto" w:fill="EEF3F9"/>
           </w:tcPr>
           <w:p>
             <w:r>
               <w:rPr>
-                <w:sz w:val="20"/>
+                <w:b w:val="0"/>
+                <w:sz w:val="22"/>
               </w:rPr>
               <w:t>1 min 30 s</w:t>
             </w:r>
@@ -2052,15 +2593,16 @@
       <w:tr>
         <w:tc>
           <w:tcPr>
-            <w:tcW w:type="dxa" w:w="4535"/>
+            <w:tcW w:type="dxa" w:w="4252"/>
             <w:shd w:val="clear" w:color="auto" w:fill="FFFFFF"/>
           </w:tcPr>
           <w:p>
             <w:r>
               <w:rPr>
-                <w:sz w:val="20"/>
+                <w:b w:val="0"/>
+                <w:sz w:val="22"/>
               </w:rPr>
-              <w:t>12 — Trading Backtest</w:t>
+              <w:t>12 — Trading</w:t>
             </w:r>
           </w:p>
         </w:tc>
@@ -2072,7 +2614,8 @@
           <w:p>
             <w:r>
               <w:rPr>
-                <w:sz w:val="20"/>
+                <w:b w:val="0"/>
+                <w:sz w:val="22"/>
               </w:rPr>
               <w:t>LYAM</w:t>
             </w:r>
@@ -2080,13 +2623,14 @@
         </w:tc>
         <w:tc>
           <w:tcPr>
-            <w:tcW w:type="dxa" w:w="1701"/>
+            <w:tcW w:type="dxa" w:w="1814"/>
             <w:shd w:val="clear" w:color="auto" w:fill="FFFFFF"/>
           </w:tcPr>
           <w:p>
             <w:r>
               <w:rPr>
-                <w:sz w:val="20"/>
+                <w:b w:val="0"/>
+                <w:sz w:val="22"/>
               </w:rPr>
               <w:t>1 min</w:t>
             </w:r>
@@ -2096,13 +2640,14 @@
       <w:tr>
         <w:tc>
           <w:tcPr>
-            <w:tcW w:type="dxa" w:w="4535"/>
+            <w:tcW w:type="dxa" w:w="4252"/>
             <w:shd w:val="clear" w:color="auto" w:fill="EEF3F9"/>
           </w:tcPr>
           <w:p>
             <w:r>
               <w:rPr>
-                <w:sz w:val="20"/>
+                <w:b w:val="0"/>
+                <w:sz w:val="22"/>
               </w:rPr>
               <w:t>13 — Robustness</w:t>
             </w:r>
@@ -2116,7 +2661,8 @@
           <w:p>
             <w:r>
               <w:rPr>
-                <w:sz w:val="20"/>
+                <w:b w:val="0"/>
+                <w:sz w:val="22"/>
               </w:rPr>
               <w:t>LYAM</w:t>
             </w:r>
@@ -2124,13 +2670,14 @@
         </w:tc>
         <w:tc>
           <w:tcPr>
-            <w:tcW w:type="dxa" w:w="1701"/>
+            <w:tcW w:type="dxa" w:w="1814"/>
             <w:shd w:val="clear" w:color="auto" w:fill="EEF3F9"/>
           </w:tcPr>
           <w:p>
             <w:r>
               <w:rPr>
-                <w:sz w:val="20"/>
+                <w:b w:val="0"/>
+                <w:sz w:val="22"/>
               </w:rPr>
               <w:t>30 s</w:t>
             </w:r>
@@ -2140,13 +2687,14 @@
       <w:tr>
         <w:tc>
           <w:tcPr>
-            <w:tcW w:type="dxa" w:w="4535"/>
+            <w:tcW w:type="dxa" w:w="4252"/>
             <w:shd w:val="clear" w:color="auto" w:fill="FFFFFF"/>
           </w:tcPr>
           <w:p>
             <w:r>
               <w:rPr>
-                <w:sz w:val="20"/>
+                <w:b w:val="0"/>
+                <w:sz w:val="22"/>
               </w:rPr>
               <w:t>14 — Limitations</w:t>
             </w:r>
@@ -2160,7 +2708,8 @@
           <w:p>
             <w:r>
               <w:rPr>
-                <w:sz w:val="20"/>
+                <w:b w:val="0"/>
+                <w:sz w:val="22"/>
               </w:rPr>
               <w:t>LYAM</w:t>
             </w:r>
@@ -2168,13 +2717,14 @@
         </w:tc>
         <w:tc>
           <w:tcPr>
-            <w:tcW w:type="dxa" w:w="1701"/>
+            <w:tcW w:type="dxa" w:w="1814"/>
             <w:shd w:val="clear" w:color="auto" w:fill="FFFFFF"/>
           </w:tcPr>
           <w:p>
             <w:r>
               <w:rPr>
-                <w:sz w:val="20"/>
+                <w:b w:val="0"/>
+                <w:sz w:val="22"/>
               </w:rPr>
               <w:t>45 s</w:t>
             </w:r>
@@ -2184,13 +2734,14 @@
       <w:tr>
         <w:tc>
           <w:tcPr>
-            <w:tcW w:type="dxa" w:w="4535"/>
+            <w:tcW w:type="dxa" w:w="4252"/>
             <w:shd w:val="clear" w:color="auto" w:fill="EEF3F9"/>
           </w:tcPr>
           <w:p>
             <w:r>
               <w:rPr>
-                <w:sz w:val="20"/>
+                <w:b w:val="0"/>
+                <w:sz w:val="22"/>
               </w:rPr>
               <w:t>15 — Conclusions</w:t>
             </w:r>
@@ -2204,7 +2755,8 @@
           <w:p>
             <w:r>
               <w:rPr>
-                <w:sz w:val="20"/>
+                <w:b w:val="0"/>
+                <w:sz w:val="22"/>
               </w:rPr>
               <w:t>LYAM</w:t>
             </w:r>
@@ -2212,13 +2764,14 @@
         </w:tc>
         <w:tc>
           <w:tcPr>
-            <w:tcW w:type="dxa" w:w="1701"/>
+            <w:tcW w:type="dxa" w:w="1814"/>
             <w:shd w:val="clear" w:color="auto" w:fill="EEF3F9"/>
           </w:tcPr>
           <w:p>
             <w:r>
               <w:rPr>
-                <w:sz w:val="20"/>
+                <w:b w:val="0"/>
+                <w:sz w:val="22"/>
               </w:rPr>
               <w:t>1 min 30 s</w:t>
             </w:r>
@@ -2228,13 +2781,14 @@
       <w:tr>
         <w:tc>
           <w:tcPr>
-            <w:tcW w:type="dxa" w:w="4535"/>
+            <w:tcW w:type="dxa" w:w="4252"/>
             <w:shd w:val="clear" w:color="auto" w:fill="FFFFFF"/>
           </w:tcPr>
           <w:p>
             <w:r>
               <w:rPr>
-                <w:sz w:val="20"/>
+                <w:b w:val="0"/>
+                <w:sz w:val="22"/>
               </w:rPr>
               <w:t>16 — Questions</w:t>
             </w:r>
@@ -2248,21 +2802,23 @@
           <w:p>
             <w:r>
               <w:rPr>
-                <w:sz w:val="20"/>
+                <w:b w:val="0"/>
+                <w:sz w:val="22"/>
               </w:rPr>
-              <w:t>LEO + LYAM</w:t>
+              <w:t>BOTH</w:t>
             </w:r>
           </w:p>
         </w:tc>
         <w:tc>
           <w:tcPr>
-            <w:tcW w:type="dxa" w:w="1701"/>
+            <w:tcW w:type="dxa" w:w="1814"/>
             <w:shd w:val="clear" w:color="auto" w:fill="FFFFFF"/>
           </w:tcPr>
           <w:p>
             <w:r>
               <w:rPr>
-                <w:sz w:val="20"/>
+                <w:b w:val="0"/>
+                <w:sz w:val="22"/>
               </w:rPr>
               <w:t>20 s</w:t>
             </w:r>
@@ -2272,13 +2828,15 @@
       <w:tr>
         <w:tc>
           <w:tcPr>
-            <w:tcW w:type="dxa" w:w="4535"/>
-            <w:shd w:val="clear" w:color="auto" w:fill="EEF3F9"/>
+            <w:tcW w:type="dxa" w:w="4252"/>
+            <w:shd w:val="clear" w:color="auto" w:fill="D6E4F0"/>
           </w:tcPr>
           <w:p>
             <w:r>
               <w:rPr>
-                <w:sz w:val="20"/>
+                <w:b/>
+                <w:color w:val="002255"/>
+                <w:sz w:val="22"/>
               </w:rPr>
               <w:t>TOTAL</w:t>
             </w:r>
@@ -2287,25 +2845,29 @@
         <w:tc>
           <w:tcPr>
             <w:tcW w:type="dxa" w:w="1984"/>
-            <w:shd w:val="clear" w:color="auto" w:fill="EEF3F9"/>
+            <w:shd w:val="clear" w:color="auto" w:fill="D6E4F0"/>
           </w:tcPr>
           <w:p>
             <w:r>
               <w:rPr>
-                <w:sz w:val="20"/>
+                <w:b/>
+                <w:color w:val="002255"/>
+                <w:sz w:val="22"/>
               </w:rPr>
             </w:r>
           </w:p>
         </w:tc>
         <w:tc>
           <w:tcPr>
-            <w:tcW w:type="dxa" w:w="1701"/>
-            <w:shd w:val="clear" w:color="auto" w:fill="EEF3F9"/>
+            <w:tcW w:type="dxa" w:w="1814"/>
+            <w:shd w:val="clear" w:color="auto" w:fill="D6E4F0"/>
           </w:tcPr>
           <w:p>
             <w:r>
               <w:rPr>
-                <w:sz w:val="20"/>
+                <w:b/>
+                <w:color w:val="002255"/>
+                <w:sz w:val="22"/>
               </w:rPr>
               <w:t>~17 min</w:t>
             </w:r>
@@ -2314,12 +2876,11 @@
       </w:tr>
     </w:tbl>
     <w:p/>
-    <w:p/>
     <w:p>
       <w:pPr>
-        <w:spacing w:before="80" w:after="40"/>
+        <w:spacing w:before="160" w:after="40"/>
         <w:pBdr>
-          <w:bottom w:val="single" w:sz="12" w:space="4" w:color="002255"/>
+          <w:bottom w:val="single" w:sz="10" w:space="4" w:color="002255"/>
         </w:pBdr>
       </w:pPr>
       <w:r>
@@ -2327,7 +2888,7 @@
           <w:b/>
           <w:i w:val="0"/>
           <w:color w:val="002255"/>
-          <w:sz w:val="40"/>
+          <w:sz w:val="34"/>
         </w:rPr>
         <w:t>KEY TRANSITIONS</w:t>
       </w:r>
@@ -2340,21 +2901,15 @@
           <w:color w:val="002255"/>
           <w:sz w:val="22"/>
         </w:rPr>
-        <w:t>Slide 7 → 8  (LEO hands to LYAM):</w:t>
+        <w:t xml:space="preserve">Slide 7 → 8  (LEO to LYAM):  </w:t>
       </w:r>
-    </w:p>
-    <w:p>
-      <w:pPr>
-        <w:spacing w:before="0" w:after="80"/>
-        <w:ind w:left="227"/>
-      </w:pPr>
       <w:r>
         <w:rPr>
           <w:b w:val="0"/>
-          <w:i w:val="0"/>
-          <w:color w:val="212529"/>
+          <w:i/>
+          <w:sz w:val="22"/>
         </w:rPr>
-        <w:t>"I'll hand over to Lyam, who will explain the mechanism and show what happens in the 2022 crisis."</w:t>
+        <w:t>"Lyam will take it from here."</w:t>
       </w:r>
     </w:p>
     <w:p>
@@ -2365,21 +2920,15 @@
           <w:color w:val="002255"/>
           <w:sz w:val="22"/>
         </w:rPr>
-        <w:t>Slide 9 → 10  (LYAM continues):</w:t>
+        <w:t xml:space="preserve">Slide 9 → 10  (LYAM continues):  </w:t>
       </w:r>
-    </w:p>
-    <w:p>
-      <w:pPr>
-        <w:spacing w:before="0" w:after="80"/>
-        <w:ind w:left="227"/>
-      </w:pPr>
       <w:r>
         <w:rPr>
           <w:b w:val="0"/>
-          <w:i w:val="0"/>
-          <w:color w:val="212529"/>
+          <w:i/>
+          <w:sz w:val="22"/>
         </w:rPr>
-        <w:t>"But this only holds when those three channels are working. In 2022, they all broke at once."</w:t>
+        <w:t>"As long as they hold. In 2022, none of them did."</w:t>
       </w:r>
     </w:p>
     <w:p>
@@ -2390,21 +2939,15 @@
           <w:color w:val="002255"/>
           <w:sz w:val="22"/>
         </w:rPr>
-        <w:t>End of slide 15:</w:t>
+        <w:t xml:space="preserve">End of slide 15:  </w:t>
       </w:r>
-    </w:p>
-    <w:p>
-      <w:pPr>
-        <w:spacing w:before="0" w:after="80"/>
-        <w:ind w:left="227"/>
-      </w:pPr>
       <w:r>
         <w:rPr>
           <w:b w:val="0"/>
-          <w:i w:val="0"/>
-          <w:color w:val="212529"/>
+          <w:i/>
+          <w:sz w:val="22"/>
         </w:rPr>
-        <w:t>"Thank you very much. We're happy to take your questions."</w:t>
+        <w:t>"Thank you."</w:t>
       </w:r>
     </w:p>
     <w:sectPr>

</xml_diff>